<commit_message>
moved tugs' contact info into main branch
</commit_message>
<xml_diff>
--- a/documentation/Project-Plan.docx
+++ b/documentation/Project-Plan.docx
@@ -442,17 +442,7 @@
     <w:p>
       <w:pPr>
         <w:pStyle w:val="Normal"/>
-        <w:rPr/>
-      </w:pPr>
-      <w:r>
-        <w:rPr/>
-      </w:r>
-    </w:p>
-    <w:p>
-      <w:pPr>
-        <w:pStyle w:val="BodyText"/>
         <w:spacing w:before="0" w:after="120"/>
-        <w:ind w:left="0"/>
         <w:rPr/>
         <w:sectPr>
           <w:headerReference w:type="even" r:id="rId2"/>
@@ -500,16 +490,16 @@
         <w:tblLook w:firstRow="0" w:noVBand="0" w:lastRow="0" w:firstColumn="0" w:lastColumn="0" w:noHBand="0" w:val="0000"/>
       </w:tblPr>
       <w:tblGrid>
-        <w:gridCol w:w="2303"/>
+        <w:gridCol w:w="2302"/>
         <w:gridCol w:w="1152"/>
-        <w:gridCol w:w="3746"/>
+        <w:gridCol w:w="3747"/>
         <w:gridCol w:w="2303"/>
       </w:tblGrid>
       <w:tr>
         <w:trPr/>
         <w:tc>
           <w:tcPr>
-            <w:tcW w:w="2303" w:type="dxa"/>
+            <w:tcW w:w="2302" w:type="dxa"/>
             <w:tcBorders>
               <w:top w:val="single" w:sz="6" w:space="0" w:color="000000"/>
               <w:left w:val="single" w:sz="6" w:space="0" w:color="000000"/>
@@ -563,7 +553,7 @@
         </w:tc>
         <w:tc>
           <w:tcPr>
-            <w:tcW w:w="3746" w:type="dxa"/>
+            <w:tcW w:w="3747" w:type="dxa"/>
             <w:tcBorders>
               <w:top w:val="single" w:sz="6" w:space="0" w:color="000000"/>
               <w:left w:val="single" w:sz="6" w:space="0" w:color="000000"/>
@@ -620,7 +610,7 @@
         <w:trPr/>
         <w:tc>
           <w:tcPr>
-            <w:tcW w:w="2303" w:type="dxa"/>
+            <w:tcW w:w="2302" w:type="dxa"/>
             <w:tcBorders>
               <w:top w:val="single" w:sz="6" w:space="0" w:color="000000"/>
               <w:left w:val="single" w:sz="6" w:space="0" w:color="000000"/>
@@ -664,7 +654,7 @@
         </w:tc>
         <w:tc>
           <w:tcPr>
-            <w:tcW w:w="3746" w:type="dxa"/>
+            <w:tcW w:w="3747" w:type="dxa"/>
             <w:tcBorders>
               <w:top w:val="single" w:sz="6" w:space="0" w:color="000000"/>
               <w:left w:val="single" w:sz="6" w:space="0" w:color="000000"/>
@@ -711,7 +701,7 @@
         <w:trPr/>
         <w:tc>
           <w:tcPr>
-            <w:tcW w:w="2303" w:type="dxa"/>
+            <w:tcW w:w="2302" w:type="dxa"/>
             <w:tcBorders>
               <w:top w:val="single" w:sz="6" w:space="0" w:color="000000"/>
               <w:left w:val="single" w:sz="6" w:space="0" w:color="000000"/>
@@ -755,7 +745,7 @@
         </w:tc>
         <w:tc>
           <w:tcPr>
-            <w:tcW w:w="3746" w:type="dxa"/>
+            <w:tcW w:w="3747" w:type="dxa"/>
             <w:tcBorders>
               <w:top w:val="single" w:sz="6" w:space="0" w:color="000000"/>
               <w:left w:val="single" w:sz="6" w:space="0" w:color="000000"/>
@@ -802,7 +792,7 @@
         <w:trPr/>
         <w:tc>
           <w:tcPr>
-            <w:tcW w:w="2303" w:type="dxa"/>
+            <w:tcW w:w="2302" w:type="dxa"/>
             <w:tcBorders>
               <w:top w:val="single" w:sz="6" w:space="0" w:color="000000"/>
               <w:left w:val="single" w:sz="6" w:space="0" w:color="000000"/>
@@ -846,7 +836,7 @@
         </w:tc>
         <w:tc>
           <w:tcPr>
-            <w:tcW w:w="3746" w:type="dxa"/>
+            <w:tcW w:w="3747" w:type="dxa"/>
             <w:tcBorders>
               <w:top w:val="single" w:sz="6" w:space="0" w:color="000000"/>
               <w:left w:val="single" w:sz="6" w:space="0" w:color="000000"/>
@@ -893,7 +883,7 @@
         <w:trPr/>
         <w:tc>
           <w:tcPr>
-            <w:tcW w:w="2303" w:type="dxa"/>
+            <w:tcW w:w="2302" w:type="dxa"/>
             <w:tcBorders>
               <w:top w:val="single" w:sz="6" w:space="0" w:color="000000"/>
               <w:left w:val="single" w:sz="6" w:space="0" w:color="000000"/>
@@ -937,7 +927,7 @@
         </w:tc>
         <w:tc>
           <w:tcPr>
-            <w:tcW w:w="3746" w:type="dxa"/>
+            <w:tcW w:w="3747" w:type="dxa"/>
             <w:tcBorders>
               <w:top w:val="single" w:sz="6" w:space="0" w:color="000000"/>
               <w:left w:val="single" w:sz="6" w:space="0" w:color="000000"/>
@@ -984,7 +974,7 @@
         <w:trPr/>
         <w:tc>
           <w:tcPr>
-            <w:tcW w:w="2303" w:type="dxa"/>
+            <w:tcW w:w="2302" w:type="dxa"/>
             <w:tcBorders>
               <w:left w:val="single" w:sz="6" w:space="0" w:color="000000"/>
               <w:bottom w:val="single" w:sz="6" w:space="0" w:color="000000"/>
@@ -1026,7 +1016,7 @@
         </w:tc>
         <w:tc>
           <w:tcPr>
-            <w:tcW w:w="3746" w:type="dxa"/>
+            <w:tcW w:w="3747" w:type="dxa"/>
             <w:tcBorders>
               <w:left w:val="single" w:sz="6" w:space="0" w:color="000000"/>
               <w:bottom w:val="single" w:sz="6" w:space="0" w:color="000000"/>
@@ -1074,15 +1064,16 @@
         <w:rPr/>
       </w:pPr>
       <w:r>
+        <w:rPr/>
+      </w:r>
+      <w:r>
         <w:br w:type="page"/>
       </w:r>
-      <w:r>
-        <w:rPr/>
-      </w:r>
     </w:p>
     <w:p>
       <w:pPr>
         <w:pStyle w:val="Title"/>
+        <w:spacing w:before="0" w:after="0"/>
         <w:rPr/>
       </w:pPr>
       <w:r>
@@ -1154,6 +1145,7 @@
           <w:r>
             <w:rPr>
               <w:rStyle w:val="IndexLink"/>
+              <w:vanish w:val="false"/>
               <w:webHidden/>
             </w:rPr>
             <w:instrText xml:space="preserve"> TOC \z \o "1-3" \u \h</w:instrText>
@@ -1161,6 +1153,7 @@
           <w:r>
             <w:rPr>
               <w:rStyle w:val="IndexLink"/>
+              <w:vanish w:val="false"/>
               <w:webHidden/>
             </w:rPr>
             <w:fldChar w:fldCharType="separate"/>
@@ -1169,6 +1162,7 @@
             <w:r>
               <w:rPr>
                 <w:rStyle w:val="IndexLink"/>
+                <w:vanish w:val="false"/>
                 <w:webHidden/>
               </w:rPr>
               <w:t>1.</w:t>
@@ -1244,6 +1238,7 @@
             <w:r>
               <w:rPr>
                 <w:rStyle w:val="IndexLink"/>
+                <w:vanish w:val="false"/>
                 <w:webHidden/>
               </w:rPr>
               <w:t>1.1</w:t>
@@ -1319,6 +1314,7 @@
             <w:r>
               <w:rPr>
                 <w:rStyle w:val="IndexLink"/>
+                <w:vanish w:val="false"/>
                 <w:webHidden/>
               </w:rPr>
               <w:t>1.2</w:t>
@@ -1394,6 +1390,7 @@
             <w:r>
               <w:rPr>
                 <w:rStyle w:val="IndexLink"/>
+                <w:vanish w:val="false"/>
                 <w:webHidden/>
               </w:rPr>
               <w:t>1.3</w:t>
@@ -1469,6 +1466,7 @@
             <w:r>
               <w:rPr>
                 <w:rStyle w:val="IndexLink"/>
+                <w:vanish w:val="false"/>
                 <w:webHidden/>
               </w:rPr>
               <w:t>1.4</w:t>
@@ -1544,6 +1542,7 @@
             <w:r>
               <w:rPr>
                 <w:rStyle w:val="IndexLink"/>
+                <w:vanish w:val="false"/>
                 <w:webHidden/>
               </w:rPr>
               <w:t>1.5</w:t>
@@ -1619,6 +1618,7 @@
             <w:r>
               <w:rPr>
                 <w:rStyle w:val="IndexLink"/>
+                <w:vanish w:val="false"/>
                 <w:webHidden/>
               </w:rPr>
               <w:t>2.</w:t>
@@ -1694,6 +1694,7 @@
             <w:r>
               <w:rPr>
                 <w:rStyle w:val="IndexLink"/>
+                <w:vanish w:val="false"/>
                 <w:webHidden/>
               </w:rPr>
               <w:t>2.1</w:t>
@@ -1769,6 +1770,7 @@
             <w:r>
               <w:rPr>
                 <w:rStyle w:val="IndexLink"/>
+                <w:vanish w:val="false"/>
                 <w:webHidden/>
               </w:rPr>
               <w:t>2.2</w:t>
@@ -1844,6 +1846,7 @@
             <w:r>
               <w:rPr>
                 <w:rStyle w:val="IndexLink"/>
+                <w:vanish w:val="false"/>
                 <w:webHidden/>
               </w:rPr>
               <w:t>2.3</w:t>
@@ -1919,6 +1922,7 @@
             <w:r>
               <w:rPr>
                 <w:rStyle w:val="IndexLink"/>
+                <w:vanish w:val="false"/>
                 <w:webHidden/>
               </w:rPr>
               <w:t>2.4</w:t>
@@ -1994,6 +1998,7 @@
             <w:r>
               <w:rPr>
                 <w:rStyle w:val="IndexLink"/>
+                <w:vanish w:val="false"/>
                 <w:webHidden/>
               </w:rPr>
               <w:t>3.</w:t>
@@ -2069,6 +2074,7 @@
             <w:r>
               <w:rPr>
                 <w:rStyle w:val="IndexLink"/>
+                <w:vanish w:val="false"/>
                 <w:webHidden/>
               </w:rPr>
               <w:t>3.1</w:t>
@@ -2144,6 +2150,7 @@
             <w:r>
               <w:rPr>
                 <w:rStyle w:val="IndexLink"/>
+                <w:vanish w:val="false"/>
                 <w:webHidden/>
               </w:rPr>
               <w:t>3.2</w:t>
@@ -2219,6 +2226,7 @@
             <w:r>
               <w:rPr>
                 <w:rStyle w:val="IndexLink"/>
+                <w:vanish w:val="false"/>
                 <w:webHidden/>
               </w:rPr>
               <w:t>3.3</w:t>
@@ -2294,6 +2302,7 @@
             <w:r>
               <w:rPr>
                 <w:rStyle w:val="IndexLink"/>
+                <w:vanish w:val="false"/>
                 <w:webHidden/>
               </w:rPr>
               <w:t>4.</w:t>
@@ -2369,6 +2378,7 @@
             <w:r>
               <w:rPr>
                 <w:rStyle w:val="IndexLink"/>
+                <w:vanish w:val="false"/>
                 <w:webHidden/>
               </w:rPr>
               <w:t>4.1</w:t>
@@ -2444,6 +2454,7 @@
             <w:r>
               <w:rPr>
                 <w:rStyle w:val="IndexLink"/>
+                <w:vanish w:val="false"/>
                 <w:webHidden/>
               </w:rPr>
               <w:t>4.2</w:t>
@@ -2519,6 +2530,7 @@
             <w:r>
               <w:rPr>
                 <w:rStyle w:val="IndexLink"/>
+                <w:vanish w:val="false"/>
                 <w:webHidden/>
               </w:rPr>
               <w:t>4.3</w:t>
@@ -2595,6 +2607,7 @@
               <w:rPr>
                 <w:rStyle w:val="IndexLink"/>
                 <w:bCs/>
+                <w:vanish w:val="false"/>
                 <w:webHidden/>
               </w:rPr>
               <w:t>4.4</w:t>
@@ -2672,6 +2685,7 @@
               <w:rPr>
                 <w:rStyle w:val="IndexLink"/>
                 <w:bCs/>
+                <w:vanish w:val="false"/>
                 <w:webHidden/>
               </w:rPr>
               <w:t>4.5</w:t>
@@ -2749,6 +2763,7 @@
               <w:rPr>
                 <w:rStyle w:val="IndexLink"/>
                 <w:bCs/>
+                <w:vanish w:val="false"/>
                 <w:webHidden/>
               </w:rPr>
               <w:t>4.6</w:t>
@@ -2826,6 +2841,7 @@
               <w:rPr>
                 <w:rStyle w:val="IndexLink"/>
                 <w:bCs/>
+                <w:vanish w:val="false"/>
                 <w:webHidden/>
               </w:rPr>
               <w:t>4.7</w:t>
@@ -2903,6 +2919,7 @@
               <w:rPr>
                 <w:rStyle w:val="IndexLink"/>
                 <w:bCs/>
+                <w:vanish w:val="false"/>
                 <w:webHidden/>
               </w:rPr>
               <w:t>4.8</w:t>
@@ -2979,6 +2996,7 @@
             <w:r>
               <w:rPr>
                 <w:rStyle w:val="IndexLink"/>
+                <w:vanish w:val="false"/>
                 <w:webHidden/>
               </w:rPr>
               <w:t>5.</w:t>
@@ -3071,6 +3089,7 @@
     <w:p>
       <w:pPr>
         <w:pStyle w:val="Title"/>
+        <w:spacing w:before="0" w:after="0"/>
         <w:rPr/>
       </w:pPr>
       <w:r>
@@ -3114,8 +3133,8 @@
         <w:ind w:hanging="720" w:left="720"/>
         <w:rPr/>
       </w:pPr>
-      <w:bookmarkStart w:id="0" w:name="_Toc222330405"/>
-      <w:bookmarkStart w:id="1" w:name="_Toc524312826"/>
+      <w:bookmarkStart w:id="0" w:name="_Toc524312826"/>
+      <w:bookmarkStart w:id="1" w:name="_Toc222330405"/>
       <w:r>
         <w:rPr/>
         <w:t>Introduction</w:t>
@@ -3129,8 +3148,8 @@
         <w:ind w:hanging="720" w:left="720"/>
         <w:rPr/>
       </w:pPr>
-      <w:bookmarkStart w:id="2" w:name="_Toc222330406"/>
-      <w:bookmarkStart w:id="3" w:name="_Toc524312827"/>
+      <w:bookmarkStart w:id="2" w:name="_Toc524312827"/>
+      <w:bookmarkStart w:id="3" w:name="_Toc222330406"/>
       <w:r>
         <w:rPr/>
         <w:t>Purpose</w:t>
@@ -3143,7 +3162,6 @@
         <w:pStyle w:val="BodyText"/>
         <w:rPr/>
       </w:pPr>
-      <w:bookmarkStart w:id="4" w:name="_Toc524312829"/>
       <w:r>
         <w:rPr/>
         <w:t xml:space="preserve">The purpose of the </w:t>
@@ -3246,14 +3264,14 @@
         <w:ind w:hanging="720" w:left="720"/>
         <w:rPr/>
       </w:pPr>
+      <w:bookmarkStart w:id="4" w:name="_Toc524312828"/>
       <w:bookmarkStart w:id="5" w:name="_Toc222330407"/>
-      <w:bookmarkStart w:id="6" w:name="_Toc524312828"/>
       <w:r>
         <w:rPr/>
         <w:t>Scope</w:t>
       </w:r>
+      <w:bookmarkEnd w:id="4"/>
       <w:bookmarkEnd w:id="5"/>
-      <w:bookmarkEnd w:id="6"/>
     </w:p>
     <w:p>
       <w:pPr>
@@ -3293,14 +3311,14 @@
         <w:ind w:hanging="720" w:left="720"/>
         <w:rPr/>
       </w:pPr>
+      <w:bookmarkStart w:id="6" w:name="_Toc222330408"/>
       <w:bookmarkStart w:id="7" w:name="_Toc524312829"/>
-      <w:bookmarkStart w:id="8" w:name="_Toc222330408"/>
       <w:r>
         <w:rPr/>
         <w:t>Definitions, Acronyms, and Abbreviations</w:t>
       </w:r>
+      <w:bookmarkEnd w:id="6"/>
       <w:bookmarkEnd w:id="7"/>
-      <w:bookmarkEnd w:id="8"/>
     </w:p>
     <w:p>
       <w:pPr>
@@ -3338,14 +3356,14 @@
         <w:ind w:hanging="720" w:left="720"/>
         <w:rPr/>
       </w:pPr>
+      <w:bookmarkStart w:id="8" w:name="_Toc524312830"/>
       <w:bookmarkStart w:id="9" w:name="_Toc222330409"/>
-      <w:bookmarkStart w:id="10" w:name="_Toc524312830"/>
       <w:r>
         <w:rPr/>
         <w:t>References</w:t>
       </w:r>
+      <w:bookmarkEnd w:id="8"/>
       <w:bookmarkEnd w:id="9"/>
-      <w:bookmarkEnd w:id="10"/>
     </w:p>
     <w:p>
       <w:pPr>
@@ -3543,14 +3561,14 @@
         <w:ind w:hanging="720" w:left="720"/>
         <w:rPr/>
       </w:pPr>
+      <w:bookmarkStart w:id="10" w:name="_Toc524312831"/>
       <w:bookmarkStart w:id="11" w:name="_Toc222330410"/>
-      <w:bookmarkStart w:id="12" w:name="_Toc524312831"/>
       <w:r>
         <w:rPr/>
         <w:t>Overview</w:t>
       </w:r>
+      <w:bookmarkEnd w:id="10"/>
       <w:bookmarkEnd w:id="11"/>
-      <w:bookmarkEnd w:id="12"/>
     </w:p>
     <w:p>
       <w:pPr>
@@ -3663,14 +3681,14 @@
         <w:ind w:hanging="720" w:left="720"/>
         <w:rPr/>
       </w:pPr>
+      <w:bookmarkStart w:id="12" w:name="_Toc524312832"/>
       <w:bookmarkStart w:id="13" w:name="_Toc222330411"/>
-      <w:bookmarkStart w:id="14" w:name="_Toc524312832"/>
       <w:r>
         <w:rPr/>
         <w:t>Project Overview</w:t>
       </w:r>
+      <w:bookmarkEnd w:id="12"/>
       <w:bookmarkEnd w:id="13"/>
-      <w:bookmarkEnd w:id="14"/>
       <w:r>
         <w:rPr/>
         <w:t xml:space="preserve"> </w:t>
@@ -3682,14 +3700,14 @@
         <w:ind w:hanging="720" w:left="720"/>
         <w:rPr/>
       </w:pPr>
+      <w:bookmarkStart w:id="14" w:name="_Toc524312833"/>
       <w:bookmarkStart w:id="15" w:name="_Toc222330412"/>
-      <w:bookmarkStart w:id="16" w:name="_Toc524312833"/>
       <w:r>
         <w:rPr/>
         <w:t>Project Purpose, Scope, and Objectives</w:t>
       </w:r>
+      <w:bookmarkEnd w:id="14"/>
       <w:bookmarkEnd w:id="15"/>
-      <w:bookmarkEnd w:id="16"/>
     </w:p>
     <w:p>
       <w:pPr>
@@ -3825,14 +3843,14 @@
         <w:ind w:hanging="720" w:left="720"/>
         <w:rPr/>
       </w:pPr>
+      <w:bookmarkStart w:id="16" w:name="_Toc524312834"/>
       <w:bookmarkStart w:id="17" w:name="_Toc222330413"/>
-      <w:bookmarkStart w:id="18" w:name="_Toc524312834"/>
       <w:r>
         <w:rPr/>
         <w:t>Assumptions and Constraints</w:t>
       </w:r>
+      <w:bookmarkEnd w:id="16"/>
       <w:bookmarkEnd w:id="17"/>
-      <w:bookmarkEnd w:id="18"/>
     </w:p>
     <w:p>
       <w:pPr>
@@ -3890,14 +3908,14 @@
         <w:ind w:hanging="720" w:left="720"/>
         <w:rPr/>
       </w:pPr>
+      <w:bookmarkStart w:id="18" w:name="_Toc524312835"/>
       <w:bookmarkStart w:id="19" w:name="_Toc222330414"/>
-      <w:bookmarkStart w:id="20" w:name="_Toc524312835"/>
       <w:r>
         <w:rPr/>
         <w:t>Project Deliverables</w:t>
       </w:r>
+      <w:bookmarkEnd w:id="18"/>
       <w:bookmarkEnd w:id="19"/>
-      <w:bookmarkEnd w:id="20"/>
     </w:p>
     <w:p>
       <w:pPr>
@@ -3975,14 +3993,14 @@
         <w:ind w:hanging="720" w:left="720"/>
         <w:rPr/>
       </w:pPr>
+      <w:bookmarkStart w:id="20" w:name="_Toc524312836"/>
       <w:bookmarkStart w:id="21" w:name="_Toc222330415"/>
-      <w:bookmarkStart w:id="22" w:name="_Toc524312836"/>
       <w:r>
         <w:rPr/>
         <w:t>Evolution of the Software Development Plan</w:t>
       </w:r>
+      <w:bookmarkEnd w:id="20"/>
       <w:bookmarkEnd w:id="21"/>
-      <w:bookmarkEnd w:id="22"/>
     </w:p>
     <w:p>
       <w:pPr>
@@ -4020,14 +4038,14 @@
         <w:ind w:hanging="720" w:left="720"/>
         <w:rPr/>
       </w:pPr>
+      <w:bookmarkStart w:id="22" w:name="_Toc524312837"/>
       <w:bookmarkStart w:id="23" w:name="_Toc222330416"/>
-      <w:bookmarkStart w:id="24" w:name="_Toc524312837"/>
       <w:r>
         <w:rPr/>
         <w:t>Project Organization</w:t>
       </w:r>
+      <w:bookmarkEnd w:id="22"/>
       <w:bookmarkEnd w:id="23"/>
-      <w:bookmarkEnd w:id="24"/>
     </w:p>
     <w:p>
       <w:pPr>
@@ -4035,14 +4053,14 @@
         <w:ind w:hanging="720" w:left="720"/>
         <w:rPr/>
       </w:pPr>
+      <w:bookmarkStart w:id="24" w:name="_Toc524312838"/>
       <w:bookmarkStart w:id="25" w:name="_Toc222330417"/>
-      <w:bookmarkStart w:id="26" w:name="_Toc524312838"/>
       <w:r>
         <w:rPr/>
         <w:t>Organizational Structure</w:t>
       </w:r>
+      <w:bookmarkEnd w:id="24"/>
       <w:bookmarkEnd w:id="25"/>
-      <w:bookmarkEnd w:id="26"/>
     </w:p>
     <w:p>
       <w:pPr>
@@ -4053,9 +4071,6 @@
       <w:r>
         <w:rPr/>
         <w:tab/>
-      </w:r>
-      <w:r>
-        <w:rPr/>
         <w:t>We function as a small team in which anyone can perform any role if necessary, though under normal circumstances section 3.3 will be accurate. Our performance will be reviewed regularly by ourselves and by Professor Saiedian.</w:t>
       </w:r>
     </w:p>
@@ -4065,14 +4080,14 @@
         <w:ind w:hanging="720" w:left="720"/>
         <w:rPr/>
       </w:pPr>
+      <w:bookmarkStart w:id="26" w:name="_Toc524312839"/>
       <w:bookmarkStart w:id="27" w:name="_Toc222330418"/>
-      <w:bookmarkStart w:id="28" w:name="_Toc524312839"/>
       <w:r>
         <w:rPr/>
         <w:t>External Interfaces</w:t>
       </w:r>
+      <w:bookmarkEnd w:id="26"/>
       <w:bookmarkEnd w:id="27"/>
-      <w:bookmarkEnd w:id="28"/>
     </w:p>
     <w:p>
       <w:pPr>
@@ -4100,13 +4115,13 @@
           <w:highlight w:val="green"/>
         </w:rPr>
       </w:pPr>
-      <w:bookmarkStart w:id="29" w:name="_Toc222330419"/>
-      <w:bookmarkStart w:id="30" w:name="_Toc524312840"/>
+      <w:bookmarkStart w:id="28" w:name="_Toc222330419"/>
+      <w:bookmarkStart w:id="29" w:name="_Toc524312840"/>
       <w:r>
         <w:rPr/>
         <w:t>Roles and Responsibilities</w:t>
       </w:r>
-      <w:bookmarkEnd w:id="30"/>
+      <w:bookmarkEnd w:id="29"/>
       <w:r>
         <w:rPr/>
         <w:t xml:space="preserve"> </w:t>
@@ -4121,7 +4136,7 @@
         </w:rPr>
         <w:t>[the more details here, the easier your job; include contact info, availability info, expertise, …]</w:t>
       </w:r>
-      <w:bookmarkEnd w:id="29"/>
+      <w:bookmarkEnd w:id="28"/>
     </w:p>
     <w:tbl>
       <w:tblPr>
@@ -4138,14 +4153,14 @@
         <w:tblLook w:firstRow="0" w:noVBand="0" w:lastRow="0" w:firstColumn="0" w:lastColumn="0" w:noHBand="0" w:val="0000"/>
       </w:tblPr>
       <w:tblGrid>
-        <w:gridCol w:w="3193"/>
-        <w:gridCol w:w="4856"/>
+        <w:gridCol w:w="3192"/>
+        <w:gridCol w:w="4857"/>
       </w:tblGrid>
       <w:tr>
         <w:trPr/>
         <w:tc>
           <w:tcPr>
-            <w:tcW w:w="3193" w:type="dxa"/>
+            <w:tcW w:w="3192" w:type="dxa"/>
             <w:tcBorders>
               <w:top w:val="outset" w:sz="6" w:space="0" w:color="000000"/>
               <w:left w:val="outset" w:sz="6" w:space="0" w:color="000000"/>
@@ -4173,7 +4188,7 @@
         </w:tc>
         <w:tc>
           <w:tcPr>
-            <w:tcW w:w="4856" w:type="dxa"/>
+            <w:tcW w:w="4857" w:type="dxa"/>
             <w:tcBorders>
               <w:top w:val="outset" w:sz="6" w:space="0" w:color="000000"/>
               <w:left w:val="outset" w:sz="6" w:space="0" w:color="000000"/>
@@ -4204,7 +4219,7 @@
         <w:trPr/>
         <w:tc>
           <w:tcPr>
-            <w:tcW w:w="3193" w:type="dxa"/>
+            <w:tcW w:w="3192" w:type="dxa"/>
             <w:tcBorders>
               <w:top w:val="outset" w:sz="6" w:space="0" w:color="000000"/>
               <w:left w:val="outset" w:sz="6" w:space="0" w:color="000000"/>
@@ -4293,7 +4308,7 @@
         </w:tc>
         <w:tc>
           <w:tcPr>
-            <w:tcW w:w="4856" w:type="dxa"/>
+            <w:tcW w:w="4857" w:type="dxa"/>
             <w:tcBorders>
               <w:top w:val="outset" w:sz="6" w:space="0" w:color="000000"/>
               <w:left w:val="outset" w:sz="6" w:space="0" w:color="000000"/>
@@ -4322,7 +4337,7 @@
         <w:trPr/>
         <w:tc>
           <w:tcPr>
-            <w:tcW w:w="3193" w:type="dxa"/>
+            <w:tcW w:w="3192" w:type="dxa"/>
             <w:tcBorders>
               <w:top w:val="outset" w:sz="6" w:space="0" w:color="000000"/>
               <w:left w:val="outset" w:sz="6" w:space="0" w:color="000000"/>
@@ -4411,7 +4426,7 @@
         </w:tc>
         <w:tc>
           <w:tcPr>
-            <w:tcW w:w="4856" w:type="dxa"/>
+            <w:tcW w:w="4857" w:type="dxa"/>
             <w:tcBorders>
               <w:top w:val="outset" w:sz="6" w:space="0" w:color="000000"/>
               <w:left w:val="outset" w:sz="6" w:space="0" w:color="000000"/>
@@ -4440,7 +4455,7 @@
         <w:trPr/>
         <w:tc>
           <w:tcPr>
-            <w:tcW w:w="3193" w:type="dxa"/>
+            <w:tcW w:w="3192" w:type="dxa"/>
             <w:tcBorders>
               <w:left w:val="outset" w:sz="6" w:space="0" w:color="000000"/>
               <w:bottom w:val="outset" w:sz="6" w:space="0" w:color="000000"/>
@@ -4459,12 +4474,74 @@
               <w:rPr>
                 <w:szCs w:val="24"/>
               </w:rPr>
+              <w:t>Tugs-Oyut Tsedensodnom</w:t>
+            </w:r>
+          </w:p>
+          <w:p>
+            <w:pPr>
+              <w:pStyle w:val="ListParagraph"/>
+              <w:numPr>
+                <w:ilvl w:val="0"/>
+                <w:numId w:val="15"/>
+              </w:numPr>
+              <w:rPr>
+                <w:szCs w:val="24"/>
+              </w:rPr>
+            </w:pPr>
+            <w:r>
+              <w:rPr>
+                <w:szCs w:val="24"/>
+              </w:rPr>
+              <w:t xml:space="preserve">Email: </w:t>
+            </w:r>
+            <w:hyperlink r:id="rId10">
+              <w:r>
+                <w:rPr>
+                  <w:rStyle w:val="Hyperlink"/>
+                  <w:szCs w:val="24"/>
+                </w:rPr>
+                <w:t>t226t008@ku.edu</w:t>
+              </w:r>
+            </w:hyperlink>
+          </w:p>
+          <w:p>
+            <w:pPr>
+              <w:pStyle w:val="ListParagraph"/>
+              <w:numPr>
+                <w:ilvl w:val="0"/>
+                <w:numId w:val="15"/>
+              </w:numPr>
+              <w:rPr>
+                <w:szCs w:val="24"/>
+              </w:rPr>
+            </w:pPr>
+            <w:r>
+              <w:rPr>
+                <w:szCs w:val="24"/>
+              </w:rPr>
+              <w:t>GitHub: TugsTS</w:t>
+            </w:r>
+          </w:p>
+          <w:p>
+            <w:pPr>
+              <w:pStyle w:val="ListParagraph"/>
+              <w:numPr>
+                <w:ilvl w:val="0"/>
+                <w:numId w:val="15"/>
+              </w:numPr>
+              <w:rPr>
+                <w:szCs w:val="24"/>
+              </w:rPr>
+            </w:pPr>
+            <w:r>
+              <w:rPr/>
+              <w:t>Expertise: Python, C</w:t>
             </w:r>
           </w:p>
         </w:tc>
         <w:tc>
           <w:tcPr>
-            <w:tcW w:w="4856" w:type="dxa"/>
+            <w:tcW w:w="4857" w:type="dxa"/>
             <w:tcBorders>
               <w:left w:val="outset" w:sz="6" w:space="0" w:color="000000"/>
               <w:bottom w:val="outset" w:sz="6" w:space="0" w:color="000000"/>
@@ -4483,6 +4560,7 @@
               <w:rPr>
                 <w:szCs w:val="24"/>
               </w:rPr>
+              <w:t>Programmer</w:t>
             </w:r>
           </w:p>
         </w:tc>
@@ -4491,7 +4569,7 @@
         <w:trPr/>
         <w:tc>
           <w:tcPr>
-            <w:tcW w:w="3193" w:type="dxa"/>
+            <w:tcW w:w="3192" w:type="dxa"/>
             <w:tcBorders>
               <w:left w:val="outset" w:sz="6" w:space="0" w:color="000000"/>
               <w:bottom w:val="outset" w:sz="6" w:space="0" w:color="000000"/>
@@ -4515,7 +4593,7 @@
         </w:tc>
         <w:tc>
           <w:tcPr>
-            <w:tcW w:w="4856" w:type="dxa"/>
+            <w:tcW w:w="4857" w:type="dxa"/>
             <w:tcBorders>
               <w:left w:val="outset" w:sz="6" w:space="0" w:color="000000"/>
               <w:bottom w:val="outset" w:sz="6" w:space="0" w:color="000000"/>
@@ -4542,7 +4620,7 @@
         <w:trPr/>
         <w:tc>
           <w:tcPr>
-            <w:tcW w:w="3193" w:type="dxa"/>
+            <w:tcW w:w="3192" w:type="dxa"/>
             <w:tcBorders>
               <w:left w:val="outset" w:sz="6" w:space="0" w:color="000000"/>
               <w:bottom w:val="outset" w:sz="6" w:space="0" w:color="000000"/>
@@ -4566,7 +4644,7 @@
         </w:tc>
         <w:tc>
           <w:tcPr>
-            <w:tcW w:w="4856" w:type="dxa"/>
+            <w:tcW w:w="4857" w:type="dxa"/>
             <w:tcBorders>
               <w:left w:val="outset" w:sz="6" w:space="0" w:color="000000"/>
               <w:bottom w:val="outset" w:sz="6" w:space="0" w:color="000000"/>
@@ -4593,7 +4671,7 @@
         <w:trPr/>
         <w:tc>
           <w:tcPr>
-            <w:tcW w:w="3193" w:type="dxa"/>
+            <w:tcW w:w="3192" w:type="dxa"/>
             <w:tcBorders>
               <w:left w:val="outset" w:sz="6" w:space="0" w:color="000000"/>
               <w:bottom w:val="outset" w:sz="6" w:space="0" w:color="000000"/>
@@ -4617,7 +4695,7 @@
         </w:tc>
         <w:tc>
           <w:tcPr>
-            <w:tcW w:w="4856" w:type="dxa"/>
+            <w:tcW w:w="4857" w:type="dxa"/>
             <w:tcBorders>
               <w:left w:val="outset" w:sz="6" w:space="0" w:color="000000"/>
               <w:bottom w:val="outset" w:sz="6" w:space="0" w:color="000000"/>
@@ -4660,7 +4738,7 @@
         <w:rPr/>
         <w:t xml:space="preserve">Anyone on the project can perform </w:t>
       </w:r>
-      <w:hyperlink r:id="rId10">
+      <w:hyperlink r:id="rId11">
         <w:r>
           <w:rPr>
             <w:rStyle w:val="Hyperlink"/>
@@ -4682,7 +4760,7 @@
         <w:rPr/>
         <w:t xml:space="preserve">For in-person availability, refer to this link: </w:t>
       </w:r>
-      <w:hyperlink r:id="rId11">
+      <w:hyperlink r:id="rId12">
         <w:r>
           <w:rPr>
             <w:rStyle w:val="Hyperlink"/>
@@ -4710,14 +4788,14 @@
         <w:ind w:hanging="720" w:left="720"/>
         <w:rPr/>
       </w:pPr>
+      <w:bookmarkStart w:id="30" w:name="_Toc524312841"/>
       <w:bookmarkStart w:id="31" w:name="_Toc222330420"/>
-      <w:bookmarkStart w:id="32" w:name="_Toc524312841"/>
       <w:r>
         <w:rPr/>
         <w:t>Management Process</w:t>
       </w:r>
+      <w:bookmarkEnd w:id="30"/>
       <w:bookmarkEnd w:id="31"/>
-      <w:bookmarkEnd w:id="32"/>
     </w:p>
     <w:p>
       <w:pPr>
@@ -4725,14 +4803,14 @@
         <w:ind w:hanging="720" w:left="720"/>
         <w:rPr/>
       </w:pPr>
+      <w:bookmarkStart w:id="32" w:name="_Toc524312842"/>
       <w:bookmarkStart w:id="33" w:name="_Toc222330421"/>
-      <w:bookmarkStart w:id="34" w:name="_Toc524312842"/>
       <w:r>
         <w:rPr/>
         <w:t>Project Estimates</w:t>
       </w:r>
+      <w:bookmarkEnd w:id="32"/>
       <w:bookmarkEnd w:id="33"/>
-      <w:bookmarkEnd w:id="34"/>
     </w:p>
     <w:p>
       <w:pPr>
@@ -4743,8 +4821,6 @@
           <w:color w:val="auto"/>
         </w:rPr>
       </w:pPr>
-      <w:bookmarkStart w:id="35" w:name="_Toc222330422"/>
-      <w:bookmarkStart w:id="36" w:name="_Toc524312843"/>
       <w:r>
         <w:rPr>
           <w:i w:val="false"/>
@@ -4760,14 +4836,14 @@
         <w:ind w:hanging="720" w:left="720"/>
         <w:rPr/>
       </w:pPr>
-      <w:bookmarkStart w:id="37" w:name="_Toc222330422"/>
-      <w:bookmarkStart w:id="38" w:name="_Toc524312843"/>
+      <w:bookmarkStart w:id="34" w:name="_Toc524312843"/>
+      <w:bookmarkStart w:id="35" w:name="_Toc222330422"/>
       <w:r>
         <w:rPr/>
         <w:t>Project Plan</w:t>
       </w:r>
-      <w:bookmarkEnd w:id="37"/>
-      <w:bookmarkEnd w:id="38"/>
+      <w:bookmarkEnd w:id="34"/>
+      <w:bookmarkEnd w:id="35"/>
     </w:p>
     <w:p>
       <w:pPr>
@@ -4778,14 +4854,7 @@
       <w:r>
         <w:rPr/>
         <w:tab/>
-      </w:r>
-      <w:r>
-        <w:rPr/>
-        <w:t xml:space="preserve">Major milestone dates can be found in section </w:t>
-      </w:r>
-      <w:r>
-        <w:rPr/>
-        <w:t>2.3. Project status will be reviewed weekly in our regular meetings. Meetings are tentatively scheduled at 5:00 PM on Tuesdays, though this may differ from week to week.</w:t>
+        <w:t>Major milestone dates can be found in section 2.3. Project status will be reviewed weekly in our regular meetings. Meetings are tentatively scheduled at 5:00 PM on Tuesdays, though this may differ from week to week.</w:t>
       </w:r>
     </w:p>
     <w:p>
@@ -4794,18 +4863,18 @@
         <w:ind w:hanging="720" w:left="720"/>
         <w:rPr/>
       </w:pPr>
-      <w:bookmarkStart w:id="39" w:name="_Toc524312844"/>
-      <w:bookmarkStart w:id="40" w:name="_Toc222330423"/>
+      <w:bookmarkStart w:id="36" w:name="_Toc524312844"/>
+      <w:bookmarkStart w:id="37" w:name="_Toc222330423"/>
       <w:r>
         <w:rPr/>
         <w:t>Phase Plan</w:t>
       </w:r>
-      <w:bookmarkEnd w:id="40"/>
+      <w:bookmarkEnd w:id="37"/>
       <w:r>
         <w:rPr/>
         <w:t xml:space="preserve"> </w:t>
       </w:r>
-      <w:bookmarkEnd w:id="39"/>
+      <w:bookmarkEnd w:id="36"/>
     </w:p>
     <w:p>
       <w:pPr>
@@ -4816,8 +4885,6 @@
           <w:color w:val="auto"/>
         </w:rPr>
       </w:pPr>
-      <w:bookmarkStart w:id="41" w:name="_Toc222330424"/>
-      <w:bookmarkStart w:id="42" w:name="_Toc524312845"/>
       <w:r>
         <w:rPr>
           <w:i w:val="false"/>
@@ -4833,14 +4900,14 @@
         <w:ind w:hanging="720" w:left="720"/>
         <w:rPr/>
       </w:pPr>
-      <w:bookmarkStart w:id="43" w:name="_Toc222330424"/>
-      <w:bookmarkStart w:id="44" w:name="_Toc524312845"/>
+      <w:bookmarkStart w:id="38" w:name="_Toc524312845"/>
+      <w:bookmarkStart w:id="39" w:name="_Toc222330424"/>
       <w:r>
         <w:rPr/>
         <w:t>Iteration Objectives</w:t>
       </w:r>
-      <w:bookmarkEnd w:id="43"/>
-      <w:bookmarkEnd w:id="44"/>
+      <w:bookmarkEnd w:id="38"/>
+      <w:bookmarkEnd w:id="39"/>
     </w:p>
     <w:p>
       <w:pPr>
@@ -4851,9 +4918,6 @@
       <w:r>
         <w:rPr/>
         <w:tab/>
-      </w:r>
-      <w:r>
-        <w:rPr/>
         <w:t>Project Planning Phase:</w:t>
       </w:r>
     </w:p>
@@ -4890,9 +4954,6 @@
       <w:r>
         <w:rPr/>
         <w:tab/>
-      </w:r>
-      <w:r>
-        <w:rPr/>
         <w:t>Software Requirements Phase:</w:t>
       </w:r>
     </w:p>
@@ -4956,11 +5017,7 @@
       </w:pPr>
       <w:r>
         <w:rPr/>
-        <w:t xml:space="preserve">Organize </w:t>
-      </w:r>
-      <w:r>
-        <w:rPr/>
-        <w:t>product features based on level of integration required, for example: a GUI component of the product can largely be built around a functioning core in this case, whereas a syntax tree viewer must be considered during the core functionality iterations.</w:t>
+        <w:t>Organize product features based on level of integration required, for example: a GUI component of the product can largely be built around a functioning core in this case, whereas a syntax tree viewer must be considered during the core functionality iterations.</w:t>
       </w:r>
     </w:p>
     <w:p>
@@ -5106,11 +5163,7 @@
       </w:pPr>
       <w:r>
         <w:rPr/>
-        <w:t xml:space="preserve">Create a user manual and </w:t>
-      </w:r>
-      <w:r>
-        <w:rPr/>
-        <w:t>finalize the user interface components of the product.</w:t>
+        <w:t>Create a user manual and finalize the user interface components of the product.</w:t>
       </w:r>
     </w:p>
     <w:p>
@@ -5119,14 +5172,14 @@
         <w:ind w:hanging="720" w:left="720"/>
         <w:rPr/>
       </w:pPr>
-      <w:bookmarkStart w:id="45" w:name="_Toc222330425"/>
-      <w:bookmarkStart w:id="46" w:name="_Toc524312846"/>
+      <w:bookmarkStart w:id="40" w:name="_Toc524312846"/>
+      <w:bookmarkStart w:id="41" w:name="_Toc222330425"/>
       <w:r>
         <w:rPr/>
         <w:t>Releases</w:t>
       </w:r>
-      <w:bookmarkEnd w:id="45"/>
-      <w:bookmarkEnd w:id="46"/>
+      <w:bookmarkEnd w:id="40"/>
+      <w:bookmarkEnd w:id="41"/>
     </w:p>
     <w:p>
       <w:pPr>
@@ -5137,9 +5190,6 @@
       <w:r>
         <w:rPr/>
         <w:tab/>
-      </w:r>
-      <w:r>
-        <w:rPr/>
         <w:t>The primary release will be a complete product, the scope and specificity of the project should not require a beta testing phase. A secondary release may be pursued after the primary to add additional features.</w:t>
       </w:r>
     </w:p>
@@ -5149,14 +5199,14 @@
         <w:ind w:hanging="720" w:left="720"/>
         <w:rPr/>
       </w:pPr>
-      <w:bookmarkStart w:id="47" w:name="_Toc222330426"/>
-      <w:bookmarkStart w:id="48" w:name="_Toc524312847"/>
+      <w:bookmarkStart w:id="42" w:name="_Toc524312847"/>
+      <w:bookmarkStart w:id="43" w:name="_Toc222330426"/>
       <w:r>
         <w:rPr/>
         <w:t>Project Schedule</w:t>
       </w:r>
-      <w:bookmarkEnd w:id="47"/>
-      <w:bookmarkEnd w:id="48"/>
+      <w:bookmarkEnd w:id="42"/>
+      <w:bookmarkEnd w:id="43"/>
     </w:p>
     <w:p>
       <w:pPr>
@@ -5244,14 +5294,14 @@
         <w:ind w:hanging="720" w:left="720"/>
         <w:rPr/>
       </w:pPr>
-      <w:bookmarkStart w:id="49" w:name="_Toc222330427"/>
-      <w:bookmarkStart w:id="50" w:name="_Toc524312848"/>
+      <w:bookmarkStart w:id="44" w:name="_Toc524312848"/>
+      <w:bookmarkStart w:id="45" w:name="_Toc222330427"/>
       <w:r>
         <w:rPr/>
         <w:t>Project Resourcing</w:t>
       </w:r>
-      <w:bookmarkEnd w:id="49"/>
-      <w:bookmarkEnd w:id="50"/>
+      <w:bookmarkEnd w:id="44"/>
+      <w:bookmarkEnd w:id="45"/>
     </w:p>
     <w:p>
       <w:pPr>
@@ -5262,32 +5312,37 @@
           <w:color w:val="auto"/>
         </w:rPr>
       </w:pPr>
-      <w:bookmarkStart w:id="51" w:name="_Toc222330428"/>
-      <w:bookmarkStart w:id="52" w:name="_Toc513004379"/>
-      <w:bookmarkStart w:id="53" w:name="_Toc447095892"/>
-      <w:bookmarkStart w:id="54" w:name="_Toc512930361"/>
-      <w:bookmarkStart w:id="55" w:name="_Toc447095893"/>
-      <w:bookmarkStart w:id="56" w:name="_Toc512930362"/>
-      <w:bookmarkStart w:id="57" w:name="_Toc430447687"/>
-      <w:bookmarkStart w:id="58" w:name="_Toc447095894"/>
-      <w:bookmarkStart w:id="59" w:name="_Toc512930363"/>
-      <w:bookmarkStart w:id="60" w:name="_Toc430447688"/>
+      <w:bookmarkStart w:id="46" w:name="_Toc447095880"/>
+      <w:bookmarkStart w:id="47" w:name="_Toc456600917"/>
+      <w:bookmarkStart w:id="48" w:name="_Toc456598586"/>
+      <w:bookmarkStart w:id="49" w:name="_Toc512930368"/>
+      <w:bookmarkStart w:id="50" w:name="_Toc447095908"/>
+      <w:bookmarkStart w:id="51" w:name="_Toc512930367"/>
+      <w:bookmarkStart w:id="52" w:name="_Toc447095898"/>
+      <w:bookmarkStart w:id="53" w:name="_Toc430447691"/>
+      <w:bookmarkStart w:id="54" w:name="_Toc512930366"/>
+      <w:bookmarkStart w:id="55" w:name="_Toc447095897"/>
+      <w:bookmarkStart w:id="56" w:name="_Toc512930365"/>
+      <w:bookmarkStart w:id="57" w:name="_Toc447095896"/>
+      <w:bookmarkStart w:id="58" w:name="_Toc430447690"/>
+      <w:bookmarkStart w:id="59" w:name="_Toc512930364"/>
+      <w:bookmarkStart w:id="60" w:name="_Toc447095895"/>
       <w:bookmarkStart w:id="61" w:name="_Toc430447689"/>
-      <w:bookmarkStart w:id="62" w:name="_Toc447095895"/>
-      <w:bookmarkStart w:id="63" w:name="_Toc512930364"/>
-      <w:bookmarkStart w:id="64" w:name="_Toc430447690"/>
-      <w:bookmarkStart w:id="65" w:name="_Toc447095896"/>
-      <w:bookmarkStart w:id="66" w:name="_Toc512930365"/>
-      <w:bookmarkStart w:id="67" w:name="_Toc447095897"/>
-      <w:bookmarkStart w:id="68" w:name="_Toc512930366"/>
-      <w:bookmarkStart w:id="69" w:name="_Toc430447691"/>
-      <w:bookmarkStart w:id="70" w:name="_Toc447095898"/>
-      <w:bookmarkStart w:id="71" w:name="_Toc512930367"/>
-      <w:bookmarkStart w:id="72" w:name="_Toc447095908"/>
-      <w:bookmarkStart w:id="73" w:name="_Toc512930368"/>
-      <w:bookmarkStart w:id="74" w:name="_Toc456598586"/>
-      <w:bookmarkStart w:id="75" w:name="_Toc456600917"/>
-      <w:bookmarkStart w:id="76" w:name="_Toc447095880"/>
+      <w:bookmarkStart w:id="62" w:name="_Toc430447688"/>
+      <w:bookmarkStart w:id="63" w:name="_Toc512930363"/>
+      <w:bookmarkStart w:id="64" w:name="_Toc447095894"/>
+      <w:bookmarkStart w:id="65" w:name="_Toc430447687"/>
+      <w:bookmarkStart w:id="66" w:name="_Toc512930362"/>
+      <w:bookmarkStart w:id="67" w:name="_Toc447095893"/>
+      <w:bookmarkStart w:id="68" w:name="_Toc512930361"/>
+      <w:bookmarkStart w:id="69" w:name="_Toc447095892"/>
+      <w:bookmarkEnd w:id="46"/>
+      <w:bookmarkEnd w:id="47"/>
+      <w:bookmarkEnd w:id="48"/>
+      <w:bookmarkEnd w:id="49"/>
+      <w:bookmarkEnd w:id="50"/>
+      <w:bookmarkEnd w:id="51"/>
+      <w:bookmarkEnd w:id="52"/>
       <w:bookmarkEnd w:id="53"/>
       <w:bookmarkEnd w:id="54"/>
       <w:bookmarkEnd w:id="55"/>
@@ -5305,13 +5360,6 @@
       <w:bookmarkEnd w:id="67"/>
       <w:bookmarkEnd w:id="68"/>
       <w:bookmarkEnd w:id="69"/>
-      <w:bookmarkEnd w:id="70"/>
-      <w:bookmarkEnd w:id="71"/>
-      <w:bookmarkEnd w:id="72"/>
-      <w:bookmarkEnd w:id="73"/>
-      <w:bookmarkEnd w:id="74"/>
-      <w:bookmarkEnd w:id="75"/>
-      <w:bookmarkEnd w:id="76"/>
       <w:r>
         <w:rPr>
           <w:i w:val="false"/>
@@ -5327,14 +5375,14 @@
         <w:ind w:hanging="720" w:left="720"/>
         <w:rPr/>
       </w:pPr>
-      <w:bookmarkStart w:id="77" w:name="_Toc222330428"/>
-      <w:bookmarkStart w:id="78" w:name="_Toc513004379"/>
+      <w:bookmarkStart w:id="70" w:name="_Toc513004379"/>
+      <w:bookmarkStart w:id="71" w:name="_Toc222330428"/>
       <w:r>
         <w:rPr/>
         <w:t>Project Monitoring and Control</w:t>
       </w:r>
-      <w:bookmarkEnd w:id="77"/>
-      <w:bookmarkEnd w:id="78"/>
+      <w:bookmarkEnd w:id="70"/>
+      <w:bookmarkEnd w:id="71"/>
     </w:p>
     <w:p>
       <w:pPr>
@@ -5345,10 +5393,10 @@
           <w:b w:val="false"/>
         </w:rPr>
       </w:pPr>
-      <w:bookmarkStart w:id="79" w:name="_Toc222330429"/>
-      <w:bookmarkStart w:id="80" w:name="_Toc447095909"/>
-      <w:bookmarkStart w:id="81" w:name="_Toc447095910"/>
-      <w:bookmarkEnd w:id="81"/>
+      <w:bookmarkStart w:id="72" w:name="_Toc447095909"/>
+      <w:bookmarkStart w:id="73" w:name="_Toc222330429"/>
+      <w:bookmarkStart w:id="74" w:name="_Toc447095910"/>
+      <w:bookmarkEnd w:id="74"/>
       <w:r>
         <w:rPr>
           <w:rStyle w:val="Strong"/>
@@ -5356,8 +5404,8 @@
         </w:rPr>
         <w:t>Requirements Management</w:t>
       </w:r>
-      <w:bookmarkEnd w:id="79"/>
-      <w:bookmarkEnd w:id="80"/>
+      <w:bookmarkEnd w:id="72"/>
+      <w:bookmarkEnd w:id="73"/>
     </w:p>
     <w:p>
       <w:pPr>
@@ -5394,8 +5442,8 @@
           <w:b w:val="false"/>
         </w:rPr>
       </w:pPr>
-      <w:bookmarkStart w:id="82" w:name="_Toc222330430"/>
-      <w:bookmarkStart w:id="83" w:name="_Toc447095912"/>
+      <w:bookmarkStart w:id="75" w:name="_Toc447095912"/>
+      <w:bookmarkStart w:id="76" w:name="_Toc222330430"/>
       <w:r>
         <w:rPr>
           <w:rStyle w:val="Strong"/>
@@ -5403,8 +5451,8 @@
         </w:rPr>
         <w:t>Quality Control</w:t>
       </w:r>
-      <w:bookmarkEnd w:id="82"/>
-      <w:bookmarkEnd w:id="83"/>
+      <w:bookmarkEnd w:id="75"/>
+      <w:bookmarkEnd w:id="76"/>
     </w:p>
     <w:p>
       <w:pPr>
@@ -5461,8 +5509,8 @@
           <w:b w:val="false"/>
         </w:rPr>
       </w:pPr>
-      <w:bookmarkStart w:id="84" w:name="_Toc222330431"/>
-      <w:bookmarkStart w:id="85" w:name="_Toc447095913"/>
+      <w:bookmarkStart w:id="77" w:name="_Toc222330431"/>
+      <w:bookmarkStart w:id="78" w:name="_Toc447095913"/>
       <w:r>
         <w:rPr>
           <w:rStyle w:val="Strong"/>
@@ -5470,7 +5518,7 @@
         </w:rPr>
         <w:t xml:space="preserve">Reporting </w:t>
       </w:r>
-      <w:bookmarkEnd w:id="85"/>
+      <w:bookmarkEnd w:id="78"/>
       <w:r>
         <w:rPr>
           <w:rStyle w:val="Strong"/>
@@ -5478,7 +5526,7 @@
         </w:rPr>
         <w:t>and Measurement</w:t>
       </w:r>
-      <w:bookmarkEnd w:id="84"/>
+      <w:bookmarkEnd w:id="77"/>
     </w:p>
     <w:p>
       <w:pPr>
@@ -5489,7 +5537,7 @@
           <w:bCs w:val="false"/>
         </w:rPr>
       </w:pPr>
-      <w:bookmarkStart w:id="86" w:name="_Toc447095915"/>
+      <w:bookmarkStart w:id="79" w:name="_Toc447095915"/>
       <w:r>
         <w:rPr/>
         <w:t>This section is not currently applicable.</w:t>
@@ -5504,7 +5552,7 @@
           <w:b w:val="false"/>
         </w:rPr>
       </w:pPr>
-      <w:bookmarkStart w:id="87" w:name="_Toc222330432"/>
+      <w:bookmarkStart w:id="80" w:name="_Toc222330432"/>
       <w:r>
         <w:rPr>
           <w:rStyle w:val="Strong"/>
@@ -5512,7 +5560,7 @@
         </w:rPr>
         <w:t>Risk Management</w:t>
       </w:r>
-      <w:bookmarkEnd w:id="87"/>
+      <w:bookmarkEnd w:id="80"/>
       <w:r>
         <w:rPr>
           <w:rStyle w:val="Strong"/>
@@ -5520,7 +5568,7 @@
         </w:rPr>
         <w:t xml:space="preserve"> </w:t>
       </w:r>
-      <w:bookmarkEnd w:id="86"/>
+      <w:bookmarkEnd w:id="79"/>
     </w:p>
     <w:p>
       <w:pPr>
@@ -5549,10 +5597,10 @@
       <w:tblGrid>
         <w:gridCol w:w="627"/>
         <w:gridCol w:w="2196"/>
-        <w:gridCol w:w="1104"/>
-        <w:gridCol w:w="978"/>
-        <w:gridCol w:w="2792"/>
-        <w:gridCol w:w="1159"/>
+        <w:gridCol w:w="1103"/>
+        <w:gridCol w:w="979"/>
+        <w:gridCol w:w="2791"/>
+        <w:gridCol w:w="1160"/>
       </w:tblGrid>
       <w:tr>
         <w:trPr/>
@@ -5604,7 +5652,7 @@
         </w:tc>
         <w:tc>
           <w:tcPr>
-            <w:tcW w:w="1104" w:type="dxa"/>
+            <w:tcW w:w="1103" w:type="dxa"/>
             <w:tcBorders>
               <w:top w:val="single" w:sz="4" w:space="0" w:color="000000"/>
               <w:left w:val="single" w:sz="4" w:space="0" w:color="000000"/>
@@ -5627,7 +5675,7 @@
         </w:tc>
         <w:tc>
           <w:tcPr>
-            <w:tcW w:w="978" w:type="dxa"/>
+            <w:tcW w:w="979" w:type="dxa"/>
             <w:tcBorders>
               <w:top w:val="single" w:sz="4" w:space="0" w:color="000000"/>
               <w:left w:val="single" w:sz="4" w:space="0" w:color="000000"/>
@@ -5650,7 +5698,7 @@
         </w:tc>
         <w:tc>
           <w:tcPr>
-            <w:tcW w:w="2792" w:type="dxa"/>
+            <w:tcW w:w="2791" w:type="dxa"/>
             <w:tcBorders>
               <w:top w:val="single" w:sz="4" w:space="0" w:color="000000"/>
               <w:left w:val="single" w:sz="4" w:space="0" w:color="000000"/>
@@ -5673,7 +5721,7 @@
         </w:tc>
         <w:tc>
           <w:tcPr>
-            <w:tcW w:w="1159" w:type="dxa"/>
+            <w:tcW w:w="1160" w:type="dxa"/>
             <w:tcBorders>
               <w:top w:val="single" w:sz="4" w:space="0" w:color="000000"/>
               <w:left w:val="single" w:sz="4" w:space="0" w:color="000000"/>
@@ -5745,7 +5793,7 @@
         </w:tc>
         <w:tc>
           <w:tcPr>
-            <w:tcW w:w="1104" w:type="dxa"/>
+            <w:tcW w:w="1103" w:type="dxa"/>
             <w:tcBorders>
               <w:top w:val="single" w:sz="4" w:space="0" w:color="000000"/>
               <w:left w:val="single" w:sz="4" w:space="0" w:color="000000"/>
@@ -5768,7 +5816,7 @@
         </w:tc>
         <w:tc>
           <w:tcPr>
-            <w:tcW w:w="978" w:type="dxa"/>
+            <w:tcW w:w="979" w:type="dxa"/>
             <w:tcBorders>
               <w:top w:val="single" w:sz="4" w:space="0" w:color="000000"/>
               <w:left w:val="single" w:sz="4" w:space="0" w:color="000000"/>
@@ -5791,7 +5839,7 @@
         </w:tc>
         <w:tc>
           <w:tcPr>
-            <w:tcW w:w="2792" w:type="dxa"/>
+            <w:tcW w:w="2791" w:type="dxa"/>
             <w:tcBorders>
               <w:top w:val="single" w:sz="4" w:space="0" w:color="000000"/>
               <w:left w:val="single" w:sz="4" w:space="0" w:color="000000"/>
@@ -5814,7 +5862,7 @@
         </w:tc>
         <w:tc>
           <w:tcPr>
-            <w:tcW w:w="1159" w:type="dxa"/>
+            <w:tcW w:w="1160" w:type="dxa"/>
             <w:tcBorders>
               <w:top w:val="single" w:sz="4" w:space="0" w:color="000000"/>
               <w:left w:val="single" w:sz="4" w:space="0" w:color="000000"/>
@@ -5886,7 +5934,7 @@
         </w:tc>
         <w:tc>
           <w:tcPr>
-            <w:tcW w:w="1104" w:type="dxa"/>
+            <w:tcW w:w="1103" w:type="dxa"/>
             <w:tcBorders>
               <w:top w:val="single" w:sz="4" w:space="0" w:color="000000"/>
               <w:left w:val="single" w:sz="4" w:space="0" w:color="000000"/>
@@ -5909,7 +5957,7 @@
         </w:tc>
         <w:tc>
           <w:tcPr>
-            <w:tcW w:w="978" w:type="dxa"/>
+            <w:tcW w:w="979" w:type="dxa"/>
             <w:tcBorders>
               <w:top w:val="single" w:sz="4" w:space="0" w:color="000000"/>
               <w:left w:val="single" w:sz="4" w:space="0" w:color="000000"/>
@@ -5932,7 +5980,7 @@
         </w:tc>
         <w:tc>
           <w:tcPr>
-            <w:tcW w:w="2792" w:type="dxa"/>
+            <w:tcW w:w="2791" w:type="dxa"/>
             <w:tcBorders>
               <w:top w:val="single" w:sz="4" w:space="0" w:color="000000"/>
               <w:left w:val="single" w:sz="4" w:space="0" w:color="000000"/>
@@ -5955,7 +6003,7 @@
         </w:tc>
         <w:tc>
           <w:tcPr>
-            <w:tcW w:w="1159" w:type="dxa"/>
+            <w:tcW w:w="1160" w:type="dxa"/>
             <w:tcBorders>
               <w:top w:val="single" w:sz="4" w:space="0" w:color="000000"/>
               <w:left w:val="single" w:sz="4" w:space="0" w:color="000000"/>
@@ -6027,7 +6075,7 @@
         </w:tc>
         <w:tc>
           <w:tcPr>
-            <w:tcW w:w="1104" w:type="dxa"/>
+            <w:tcW w:w="1103" w:type="dxa"/>
             <w:tcBorders>
               <w:top w:val="single" w:sz="4" w:space="0" w:color="000000"/>
               <w:left w:val="single" w:sz="4" w:space="0" w:color="000000"/>
@@ -6050,7 +6098,7 @@
         </w:tc>
         <w:tc>
           <w:tcPr>
-            <w:tcW w:w="978" w:type="dxa"/>
+            <w:tcW w:w="979" w:type="dxa"/>
             <w:tcBorders>
               <w:top w:val="single" w:sz="4" w:space="0" w:color="000000"/>
               <w:left w:val="single" w:sz="4" w:space="0" w:color="000000"/>
@@ -6073,7 +6121,7 @@
         </w:tc>
         <w:tc>
           <w:tcPr>
-            <w:tcW w:w="2792" w:type="dxa"/>
+            <w:tcW w:w="2791" w:type="dxa"/>
             <w:tcBorders>
               <w:top w:val="single" w:sz="4" w:space="0" w:color="000000"/>
               <w:left w:val="single" w:sz="4" w:space="0" w:color="000000"/>
@@ -6096,7 +6144,7 @@
         </w:tc>
         <w:tc>
           <w:tcPr>
-            <w:tcW w:w="1159" w:type="dxa"/>
+            <w:tcW w:w="1160" w:type="dxa"/>
             <w:tcBorders>
               <w:top w:val="single" w:sz="4" w:space="0" w:color="000000"/>
               <w:left w:val="single" w:sz="4" w:space="0" w:color="000000"/>
@@ -6168,7 +6216,7 @@
         </w:tc>
         <w:tc>
           <w:tcPr>
-            <w:tcW w:w="1104" w:type="dxa"/>
+            <w:tcW w:w="1103" w:type="dxa"/>
             <w:tcBorders>
               <w:top w:val="single" w:sz="4" w:space="0" w:color="000000"/>
               <w:left w:val="single" w:sz="4" w:space="0" w:color="000000"/>
@@ -6191,7 +6239,7 @@
         </w:tc>
         <w:tc>
           <w:tcPr>
-            <w:tcW w:w="978" w:type="dxa"/>
+            <w:tcW w:w="979" w:type="dxa"/>
             <w:tcBorders>
               <w:top w:val="single" w:sz="4" w:space="0" w:color="000000"/>
               <w:left w:val="single" w:sz="4" w:space="0" w:color="000000"/>
@@ -6214,7 +6262,7 @@
         </w:tc>
         <w:tc>
           <w:tcPr>
-            <w:tcW w:w="2792" w:type="dxa"/>
+            <w:tcW w:w="2791" w:type="dxa"/>
             <w:tcBorders>
               <w:top w:val="single" w:sz="4" w:space="0" w:color="000000"/>
               <w:left w:val="single" w:sz="4" w:space="0" w:color="000000"/>
@@ -6237,7 +6285,7 @@
         </w:tc>
         <w:tc>
           <w:tcPr>
-            <w:tcW w:w="1159" w:type="dxa"/>
+            <w:tcW w:w="1160" w:type="dxa"/>
             <w:tcBorders>
               <w:top w:val="single" w:sz="4" w:space="0" w:color="000000"/>
               <w:left w:val="single" w:sz="4" w:space="0" w:color="000000"/>
@@ -6309,7 +6357,7 @@
         </w:tc>
         <w:tc>
           <w:tcPr>
-            <w:tcW w:w="1104" w:type="dxa"/>
+            <w:tcW w:w="1103" w:type="dxa"/>
             <w:tcBorders>
               <w:top w:val="single" w:sz="4" w:space="0" w:color="000000"/>
               <w:left w:val="single" w:sz="4" w:space="0" w:color="000000"/>
@@ -6332,7 +6380,7 @@
         </w:tc>
         <w:tc>
           <w:tcPr>
-            <w:tcW w:w="978" w:type="dxa"/>
+            <w:tcW w:w="979" w:type="dxa"/>
             <w:tcBorders>
               <w:top w:val="single" w:sz="4" w:space="0" w:color="000000"/>
               <w:left w:val="single" w:sz="4" w:space="0" w:color="000000"/>
@@ -6355,7 +6403,7 @@
         </w:tc>
         <w:tc>
           <w:tcPr>
-            <w:tcW w:w="2792" w:type="dxa"/>
+            <w:tcW w:w="2791" w:type="dxa"/>
             <w:tcBorders>
               <w:top w:val="single" w:sz="4" w:space="0" w:color="000000"/>
               <w:left w:val="single" w:sz="4" w:space="0" w:color="000000"/>
@@ -6378,7 +6426,7 @@
         </w:tc>
         <w:tc>
           <w:tcPr>
-            <w:tcW w:w="1159" w:type="dxa"/>
+            <w:tcW w:w="1160" w:type="dxa"/>
             <w:tcBorders>
               <w:top w:val="single" w:sz="4" w:space="0" w:color="000000"/>
               <w:left w:val="single" w:sz="4" w:space="0" w:color="000000"/>
@@ -6423,7 +6471,7 @@
           <w:b w:val="false"/>
         </w:rPr>
       </w:pPr>
-      <w:bookmarkStart w:id="88" w:name="_Toc222330433"/>
+      <w:bookmarkStart w:id="81" w:name="_Toc222330433"/>
       <w:r>
         <w:rPr>
           <w:rStyle w:val="Strong"/>
@@ -6431,7 +6479,7 @@
         </w:rPr>
         <w:t>Configuration Management</w:t>
       </w:r>
-      <w:bookmarkEnd w:id="88"/>
+      <w:bookmarkEnd w:id="81"/>
     </w:p>
     <w:p>
       <w:pPr>
@@ -6440,16 +6488,16 @@
           <w:szCs w:val="24"/>
         </w:rPr>
       </w:pPr>
-      <w:bookmarkStart w:id="89" w:name="_Toc447095917"/>
-      <w:bookmarkStart w:id="90" w:name="_Toc512930369"/>
-      <w:bookmarkStart w:id="91" w:name="_Toc447095932"/>
-      <w:bookmarkStart w:id="92" w:name="_Toc512930370"/>
-      <w:bookmarkStart w:id="93" w:name="_Toc447095916"/>
-      <w:bookmarkEnd w:id="89"/>
-      <w:bookmarkEnd w:id="90"/>
-      <w:bookmarkEnd w:id="91"/>
-      <w:bookmarkEnd w:id="92"/>
-      <w:bookmarkEnd w:id="93"/>
+      <w:bookmarkStart w:id="82" w:name="_Toc447095916"/>
+      <w:bookmarkStart w:id="83" w:name="_Toc512930370"/>
+      <w:bookmarkStart w:id="84" w:name="_Toc447095932"/>
+      <w:bookmarkStart w:id="85" w:name="_Toc512930369"/>
+      <w:bookmarkStart w:id="86" w:name="_Toc447095917"/>
+      <w:bookmarkEnd w:id="82"/>
+      <w:bookmarkEnd w:id="83"/>
+      <w:bookmarkEnd w:id="84"/>
+      <w:bookmarkEnd w:id="85"/>
+      <w:bookmarkEnd w:id="86"/>
       <w:r>
         <w:rPr/>
         <w:t xml:space="preserve">Project artifacts will be properly versioned and tracked to ensure control of the development. For this project, Git will be used to manage version control with a repository available on GitHub. Members are expected to commit newly changed or edited work to be reviewed in weekly meetings.  </w:t>
@@ -6503,14 +6551,14 @@
         <w:ind w:hanging="720" w:left="720"/>
         <w:rPr/>
       </w:pPr>
-      <w:bookmarkStart w:id="94" w:name="_Toc222330434"/>
-      <w:bookmarkStart w:id="95" w:name="_Toc513004381"/>
+      <w:bookmarkStart w:id="87" w:name="_Toc513004381"/>
+      <w:bookmarkStart w:id="88" w:name="_Toc222330434"/>
       <w:r>
         <w:rPr/>
         <w:t>Annexes</w:t>
       </w:r>
-      <w:bookmarkEnd w:id="94"/>
-      <w:bookmarkEnd w:id="95"/>
+      <w:bookmarkEnd w:id="87"/>
+      <w:bookmarkEnd w:id="88"/>
     </w:p>
     <w:p>
       <w:pPr>
@@ -6563,12 +6611,12 @@
       </w:r>
     </w:p>
     <w:sectPr>
-      <w:headerReference w:type="even" r:id="rId12"/>
-      <w:headerReference w:type="default" r:id="rId13"/>
-      <w:headerReference w:type="first" r:id="rId14"/>
-      <w:footerReference w:type="even" r:id="rId15"/>
-      <w:footerReference w:type="default" r:id="rId16"/>
-      <w:footerReference w:type="first" r:id="rId17"/>
+      <w:headerReference w:type="even" r:id="rId13"/>
+      <w:headerReference w:type="default" r:id="rId14"/>
+      <w:headerReference w:type="first" r:id="rId15"/>
+      <w:footerReference w:type="even" r:id="rId16"/>
+      <w:footerReference w:type="default" r:id="rId17"/>
+      <w:footerReference w:type="first" r:id="rId18"/>
       <w:type w:val="nextPage"/>
       <w:pgSz w:w="12240" w:h="15840"/>
       <w:pgMar w:left="1440" w:right="1440" w:gutter="0" w:header="720" w:top="1440" w:footer="720" w:bottom="1440"/>
@@ -6591,12 +6639,10 @@
     </w:pPr>
     <w:r>
       <w:rPr/>
-    </w:r>
-    <w:r>
       <mc:AlternateContent>
         <mc:Choice Requires="wps">
           <w:drawing>
-            <wp:anchor behindDoc="0" distT="0" distB="0" distL="0" distR="0" simplePos="0" locked="0" layoutInCell="1" allowOverlap="1" relativeHeight="0">
+            <wp:anchor behindDoc="1" distT="0" distB="0" distL="0" distR="0" simplePos="0" locked="0" layoutInCell="0" allowOverlap="1" relativeHeight="2">
               <wp:simplePos x="0" y="0"/>
               <wp:positionH relativeFrom="margin">
                 <wp:align>right</wp:align>
@@ -6611,19 +6657,26 @@
               <a:graphic xmlns:a="http://schemas.openxmlformats.org/drawingml/2006/main">
                 <a:graphicData uri="http://schemas.microsoft.com/office/word/2010/wordprocessingShape">
                   <wps:wsp>
-                    <wps:cNvSpPr txBox="1"/>
+                    <wps:cNvSpPr/>
                     <wps:spPr>
                       <a:xfrm>
                         <a:off x="0" y="0"/>
-                        <a:ext cx="14605" cy="14605"/>
+                        <a:ext cx="14760" cy="14760"/>
                       </a:xfrm>
-                      <a:prstGeom prst="rect"/>
-                      <a:solidFill>
-                        <a:srgbClr val="FFFFFF">
-                          <a:alpha val="0"/>
-                        </a:srgbClr>
-                      </a:solidFill>
+                      <a:prstGeom prst="rect">
+                        <a:avLst/>
+                      </a:prstGeom>
+                      <a:noFill/>
+                      <a:ln w="0">
+                        <a:noFill/>
+                      </a:ln>
                     </wps:spPr>
+                    <wps:style>
+                      <a:lnRef idx="0"/>
+                      <a:fillRef idx="0"/>
+                      <a:effectRef idx="0"/>
+                      <a:fontRef idx="minor"/>
+                    </wps:style>
                     <wps:txbx>
                       <w:txbxContent>
                         <w:p>
@@ -6666,7 +6719,7 @@
                         </w:p>
                       </w:txbxContent>
                     </wps:txbx>
-                    <wps:bodyPr anchor="t" lIns="0" tIns="0" rIns="0" bIns="0">
+                    <wps:bodyPr lIns="0" tIns="0" rIns="0" bIns="0" anchor="t">
                       <a:noAutofit/>
                     </wps:bodyPr>
                   </wps:wsp>
@@ -6677,9 +6730,10 @@
         </mc:Choice>
         <mc:Fallback>
           <w:pict>
-            <v:rect fillcolor="#FFFFFF" stroked="f" strokeweight="0pt" style="position:absolute;rotation:-0;width:1.15pt;height:1.15pt;mso-wrap-distance-left:0pt;mso-wrap-distance-right:0pt;mso-wrap-distance-top:0pt;mso-wrap-distance-bottom:0pt;margin-top:0.05pt;mso-position-vertical-relative:text;margin-left:-450.45pt;mso-position-horizontal:right;mso-position-horizontal-relative:margin">
-              <v:fill opacity="0f"/>
-              <v:textbox inset="0in,0in,0in,0in">
+            <v:rect id="shape_0" fillcolor="white" stroked="f" o:allowincell="f" style="position:absolute;margin-left:0pt;margin-top:0.05pt;width:1.1pt;height:1.1pt;mso-wrap-style:square;v-text-anchor:top;mso-position-horizontal:right;mso-position-horizontal-relative:margin">
+              <v:fill o:detectmouseclick="t" type="solid" color2="black" opacity="0"/>
+              <v:stroke color="#3465a4" joinstyle="round" endcap="flat"/>
+              <v:textbox>
                 <w:txbxContent>
                   <w:p>
                     <w:pPr>
@@ -6913,7 +6967,7 @@
             <w:rPr>
               <w:rStyle w:val="PageNumber"/>
             </w:rPr>
-            <w:t>6</w:t>
+            <w:t>9</w:t>
           </w:r>
           <w:r>
             <w:rPr>
@@ -7113,7 +7167,7 @@
             <w:rPr>
               <w:rStyle w:val="PageNumber"/>
             </w:rPr>
-            <w:t>6</w:t>
+            <w:t>9</w:t>
           </w:r>
           <w:r>
             <w:rPr>
@@ -9582,6 +9636,144 @@
       </w:rPr>
     </w:lvl>
   </w:abstractNum>
+  <w:abstractNum w:abstractNumId="15">
+    <w:lvl w:ilvl="0">
+      <w:start w:val="1"/>
+      <w:numFmt w:val="bullet"/>
+      <w:lvlText w:val=""/>
+      <w:lvlJc w:val="left"/>
+      <w:pPr>
+        <w:tabs>
+          <w:tab w:val="num" w:pos="0"/>
+        </w:tabs>
+        <w:ind w:left="720" w:hanging="360"/>
+      </w:pPr>
+      <w:rPr>
+        <w:rFonts w:ascii="Symbol" w:hAnsi="Symbol" w:cs="Symbol" w:hint="default"/>
+        <w:szCs w:val="24"/>
+      </w:rPr>
+    </w:lvl>
+    <w:lvl w:ilvl="1">
+      <w:start w:val="1"/>
+      <w:numFmt w:val="bullet"/>
+      <w:lvlText w:val="o"/>
+      <w:lvlJc w:val="left"/>
+      <w:pPr>
+        <w:tabs>
+          <w:tab w:val="num" w:pos="0"/>
+        </w:tabs>
+        <w:ind w:left="1440" w:hanging="360"/>
+      </w:pPr>
+      <w:rPr>
+        <w:rFonts w:ascii="Courier New" w:hAnsi="Courier New" w:cs="Courier New" w:hint="default"/>
+      </w:rPr>
+    </w:lvl>
+    <w:lvl w:ilvl="2">
+      <w:start w:val="1"/>
+      <w:numFmt w:val="bullet"/>
+      <w:lvlText w:val=""/>
+      <w:lvlJc w:val="left"/>
+      <w:pPr>
+        <w:tabs>
+          <w:tab w:val="num" w:pos="0"/>
+        </w:tabs>
+        <w:ind w:left="2160" w:hanging="360"/>
+      </w:pPr>
+      <w:rPr>
+        <w:rFonts w:ascii="Wingdings" w:hAnsi="Wingdings" w:cs="Wingdings" w:hint="default"/>
+      </w:rPr>
+    </w:lvl>
+    <w:lvl w:ilvl="3">
+      <w:start w:val="1"/>
+      <w:numFmt w:val="bullet"/>
+      <w:lvlText w:val=""/>
+      <w:lvlJc w:val="left"/>
+      <w:pPr>
+        <w:tabs>
+          <w:tab w:val="num" w:pos="0"/>
+        </w:tabs>
+        <w:ind w:left="2880" w:hanging="360"/>
+      </w:pPr>
+      <w:rPr>
+        <w:rFonts w:ascii="Symbol" w:hAnsi="Symbol" w:cs="Symbol" w:hint="default"/>
+      </w:rPr>
+    </w:lvl>
+    <w:lvl w:ilvl="4">
+      <w:start w:val="1"/>
+      <w:numFmt w:val="bullet"/>
+      <w:lvlText w:val="o"/>
+      <w:lvlJc w:val="left"/>
+      <w:pPr>
+        <w:tabs>
+          <w:tab w:val="num" w:pos="0"/>
+        </w:tabs>
+        <w:ind w:left="3600" w:hanging="360"/>
+      </w:pPr>
+      <w:rPr>
+        <w:rFonts w:ascii="Courier New" w:hAnsi="Courier New" w:cs="Courier New" w:hint="default"/>
+      </w:rPr>
+    </w:lvl>
+    <w:lvl w:ilvl="5">
+      <w:start w:val="1"/>
+      <w:numFmt w:val="bullet"/>
+      <w:lvlText w:val=""/>
+      <w:lvlJc w:val="left"/>
+      <w:pPr>
+        <w:tabs>
+          <w:tab w:val="num" w:pos="0"/>
+        </w:tabs>
+        <w:ind w:left="4320" w:hanging="360"/>
+      </w:pPr>
+      <w:rPr>
+        <w:rFonts w:ascii="Wingdings" w:hAnsi="Wingdings" w:cs="Wingdings" w:hint="default"/>
+      </w:rPr>
+    </w:lvl>
+    <w:lvl w:ilvl="6">
+      <w:start w:val="1"/>
+      <w:numFmt w:val="bullet"/>
+      <w:lvlText w:val=""/>
+      <w:lvlJc w:val="left"/>
+      <w:pPr>
+        <w:tabs>
+          <w:tab w:val="num" w:pos="0"/>
+        </w:tabs>
+        <w:ind w:left="5040" w:hanging="360"/>
+      </w:pPr>
+      <w:rPr>
+        <w:rFonts w:ascii="Symbol" w:hAnsi="Symbol" w:cs="Symbol" w:hint="default"/>
+      </w:rPr>
+    </w:lvl>
+    <w:lvl w:ilvl="7">
+      <w:start w:val="1"/>
+      <w:numFmt w:val="bullet"/>
+      <w:lvlText w:val="o"/>
+      <w:lvlJc w:val="left"/>
+      <w:pPr>
+        <w:tabs>
+          <w:tab w:val="num" w:pos="0"/>
+        </w:tabs>
+        <w:ind w:left="5760" w:hanging="360"/>
+      </w:pPr>
+      <w:rPr>
+        <w:rFonts w:ascii="Courier New" w:hAnsi="Courier New" w:cs="Courier New" w:hint="default"/>
+      </w:rPr>
+    </w:lvl>
+    <w:lvl w:ilvl="8">
+      <w:start w:val="1"/>
+      <w:numFmt w:val="bullet"/>
+      <w:lvlText w:val=""/>
+      <w:lvlJc w:val="left"/>
+      <w:pPr>
+        <w:tabs>
+          <w:tab w:val="num" w:pos="0"/>
+        </w:tabs>
+        <w:ind w:left="6480" w:hanging="360"/>
+      </w:pPr>
+      <w:rPr>
+        <w:rFonts w:ascii="Wingdings" w:hAnsi="Wingdings" w:cs="Wingdings" w:hint="default"/>
+      </w:rPr>
+    </w:lvl>
+  </w:abstractNum>
   <w:num w:numId="1">
     <w:abstractNumId w:val="1"/>
   </w:num>
@@ -9623,6 +9815,9 @@
   </w:num>
   <w:num w:numId="14">
     <w:abstractNumId w:val="14"/>
+  </w:num>
+  <w:num w:numId="15">
+    <w:abstractNumId w:val="15"/>
   </w:num>
 </w:numbering>
 </file>
@@ -10215,8 +10410,8 @@
     <w:basedOn w:val="DefaultParagraphFont"/>
     <w:rPr/>
   </w:style>
-  <w:style w:type="character" w:styleId="FootnoteCharactersuser" w:customStyle="1">
-    <w:name w:val="Footnote Characters (user)"/>
+  <w:style w:type="character" w:styleId="FootnoteCharacters" w:customStyle="1">
+    <w:name w:val="Footnote Characters"/>
     <w:semiHidden/>
     <w:qFormat/>
     <w:rPr>
@@ -10224,8 +10419,8 @@
       <w:vertAlign w:val="superscript"/>
     </w:rPr>
   </w:style>
-  <w:style w:type="character" w:styleId="FootnoteCharacters">
-    <w:name w:val="Footnote Characters"/>
+  <w:style w:type="character" w:styleId="FootnoteCharactersuser">
+    <w:name w:val="Footnote Characters (user)"/>
     <w:qFormat/>
     <w:rPr>
       <w:sz w:val="20"/>
@@ -10279,8 +10474,8 @@
       <w:shd w:fill="E1DFDD" w:val="clear"/>
     </w:rPr>
   </w:style>
-  <w:style w:type="character" w:styleId="Bullets">
-    <w:name w:val="Bullets"/>
+  <w:style w:type="character" w:styleId="Bulletsuser">
+    <w:name w:val="Bullets (user)"/>
     <w:qFormat/>
     <w:rPr>
       <w:rFonts w:ascii="OpenSymbol" w:hAnsi="OpenSymbol" w:eastAsia="OpenSymbol" w:cs="OpenSymbol"/>
@@ -10774,8 +10969,8 @@
       <w:color w:val="0000FF"/>
     </w:rPr>
   </w:style>
-  <w:style w:type="paragraph" w:styleId="FrameContentsuser" w:customStyle="1">
-    <w:name w:val="Frame Contents (user)"/>
+  <w:style w:type="paragraph" w:styleId="FrameContents" w:customStyle="1">
+    <w:name w:val="Frame Contents"/>
     <w:basedOn w:val="Normal"/>
     <w:qFormat/>
     <w:pPr/>
@@ -10793,11 +10988,20 @@
     </w:pPr>
     <w:rPr/>
   </w:style>
-  <w:style w:type="paragraph" w:styleId="FrameContents">
-    <w:name w:val="Frame Contents"/>
+  <w:style w:type="paragraph" w:styleId="FrameContentsuser">
+    <w:name w:val="Frame Contents (user)"/>
     <w:basedOn w:val="Normal"/>
     <w:qFormat/>
     <w:pPr/>
+    <w:rPr/>
+  </w:style>
+  <w:style w:type="paragraph" w:styleId="ListParagraph">
+    <w:name w:val="List Paragraph"/>
+    <w:basedOn w:val="Normal"/>
+    <w:qFormat/>
+    <w:pPr>
+      <w:ind w:left="720"/>
+    </w:pPr>
     <w:rPr/>
   </w:style>
   <w:style w:type="numbering" w:styleId="NoList" w:default="1">

</xml_diff>

<commit_message>
added UPEDU to the glossary
</commit_message>
<xml_diff>
--- a/documentation/Project-Plan.docx
+++ b/documentation/Project-Plan.docx
@@ -230,15 +230,6 @@
         <w:rPr>
           <w:sz w:val="28"/>
         </w:rPr>
-      </w:r>
-    </w:p>
-    <w:p>
-      <w:pPr>
-        <w:pStyle w:val="Normal"/>
-        <w:rPr/>
-      </w:pPr>
-      <w:r>
-        <w:rPr/>
       </w:r>
     </w:p>
     <w:p>
@@ -490,16 +481,16 @@
         <w:tblLook w:firstRow="0" w:noVBand="0" w:lastRow="0" w:firstColumn="0" w:lastColumn="0" w:noHBand="0" w:val="0000"/>
       </w:tblPr>
       <w:tblGrid>
-        <w:gridCol w:w="2302"/>
+        <w:gridCol w:w="2301"/>
         <w:gridCol w:w="1152"/>
-        <w:gridCol w:w="3747"/>
+        <w:gridCol w:w="3748"/>
         <w:gridCol w:w="2303"/>
       </w:tblGrid>
       <w:tr>
         <w:trPr/>
         <w:tc>
           <w:tcPr>
-            <w:tcW w:w="2302" w:type="dxa"/>
+            <w:tcW w:w="2301" w:type="dxa"/>
             <w:tcBorders>
               <w:top w:val="single" w:sz="6" w:space="0" w:color="000000"/>
               <w:left w:val="single" w:sz="6" w:space="0" w:color="000000"/>
@@ -553,7 +544,7 @@
         </w:tc>
         <w:tc>
           <w:tcPr>
-            <w:tcW w:w="3747" w:type="dxa"/>
+            <w:tcW w:w="3748" w:type="dxa"/>
             <w:tcBorders>
               <w:top w:val="single" w:sz="6" w:space="0" w:color="000000"/>
               <w:left w:val="single" w:sz="6" w:space="0" w:color="000000"/>
@@ -610,7 +601,7 @@
         <w:trPr/>
         <w:tc>
           <w:tcPr>
-            <w:tcW w:w="2302" w:type="dxa"/>
+            <w:tcW w:w="2301" w:type="dxa"/>
             <w:tcBorders>
               <w:top w:val="single" w:sz="6" w:space="0" w:color="000000"/>
               <w:left w:val="single" w:sz="6" w:space="0" w:color="000000"/>
@@ -654,7 +645,7 @@
         </w:tc>
         <w:tc>
           <w:tcPr>
-            <w:tcW w:w="3747" w:type="dxa"/>
+            <w:tcW w:w="3748" w:type="dxa"/>
             <w:tcBorders>
               <w:top w:val="single" w:sz="6" w:space="0" w:color="000000"/>
               <w:left w:val="single" w:sz="6" w:space="0" w:color="000000"/>
@@ -701,7 +692,7 @@
         <w:trPr/>
         <w:tc>
           <w:tcPr>
-            <w:tcW w:w="2302" w:type="dxa"/>
+            <w:tcW w:w="2301" w:type="dxa"/>
             <w:tcBorders>
               <w:top w:val="single" w:sz="6" w:space="0" w:color="000000"/>
               <w:left w:val="single" w:sz="6" w:space="0" w:color="000000"/>
@@ -745,7 +736,7 @@
         </w:tc>
         <w:tc>
           <w:tcPr>
-            <w:tcW w:w="3747" w:type="dxa"/>
+            <w:tcW w:w="3748" w:type="dxa"/>
             <w:tcBorders>
               <w:top w:val="single" w:sz="6" w:space="0" w:color="000000"/>
               <w:left w:val="single" w:sz="6" w:space="0" w:color="000000"/>
@@ -792,7 +783,7 @@
         <w:trPr/>
         <w:tc>
           <w:tcPr>
-            <w:tcW w:w="2302" w:type="dxa"/>
+            <w:tcW w:w="2301" w:type="dxa"/>
             <w:tcBorders>
               <w:top w:val="single" w:sz="6" w:space="0" w:color="000000"/>
               <w:left w:val="single" w:sz="6" w:space="0" w:color="000000"/>
@@ -836,7 +827,7 @@
         </w:tc>
         <w:tc>
           <w:tcPr>
-            <w:tcW w:w="3747" w:type="dxa"/>
+            <w:tcW w:w="3748" w:type="dxa"/>
             <w:tcBorders>
               <w:top w:val="single" w:sz="6" w:space="0" w:color="000000"/>
               <w:left w:val="single" w:sz="6" w:space="0" w:color="000000"/>
@@ -883,7 +874,7 @@
         <w:trPr/>
         <w:tc>
           <w:tcPr>
-            <w:tcW w:w="2302" w:type="dxa"/>
+            <w:tcW w:w="2301" w:type="dxa"/>
             <w:tcBorders>
               <w:top w:val="single" w:sz="6" w:space="0" w:color="000000"/>
               <w:left w:val="single" w:sz="6" w:space="0" w:color="000000"/>
@@ -927,7 +918,7 @@
         </w:tc>
         <w:tc>
           <w:tcPr>
-            <w:tcW w:w="3747" w:type="dxa"/>
+            <w:tcW w:w="3748" w:type="dxa"/>
             <w:tcBorders>
               <w:top w:val="single" w:sz="6" w:space="0" w:color="000000"/>
               <w:left w:val="single" w:sz="6" w:space="0" w:color="000000"/>
@@ -974,7 +965,7 @@
         <w:trPr/>
         <w:tc>
           <w:tcPr>
-            <w:tcW w:w="2302" w:type="dxa"/>
+            <w:tcW w:w="2301" w:type="dxa"/>
             <w:tcBorders>
               <w:left w:val="single" w:sz="6" w:space="0" w:color="000000"/>
               <w:bottom w:val="single" w:sz="6" w:space="0" w:color="000000"/>
@@ -1016,7 +1007,7 @@
         </w:tc>
         <w:tc>
           <w:tcPr>
-            <w:tcW w:w="3747" w:type="dxa"/>
+            <w:tcW w:w="3748" w:type="dxa"/>
             <w:tcBorders>
               <w:left w:val="single" w:sz="6" w:space="0" w:color="000000"/>
               <w:bottom w:val="single" w:sz="6" w:space="0" w:color="000000"/>
@@ -3133,8 +3124,8 @@
         <w:ind w:hanging="720" w:left="720"/>
         <w:rPr/>
       </w:pPr>
-      <w:bookmarkStart w:id="0" w:name="_Toc524312826"/>
-      <w:bookmarkStart w:id="1" w:name="_Toc222330405"/>
+      <w:bookmarkStart w:id="0" w:name="_Toc222330405"/>
+      <w:bookmarkStart w:id="1" w:name="_Toc524312826"/>
       <w:r>
         <w:rPr/>
         <w:t>Introduction</w:t>
@@ -3148,8 +3139,8 @@
         <w:ind w:hanging="720" w:left="720"/>
         <w:rPr/>
       </w:pPr>
-      <w:bookmarkStart w:id="2" w:name="_Toc524312827"/>
-      <w:bookmarkStart w:id="3" w:name="_Toc222330406"/>
+      <w:bookmarkStart w:id="2" w:name="_Toc222330406"/>
+      <w:bookmarkStart w:id="3" w:name="_Toc524312827"/>
       <w:r>
         <w:rPr/>
         <w:t>Purpose</w:t>
@@ -3264,8 +3255,8 @@
         <w:ind w:hanging="720" w:left="720"/>
         <w:rPr/>
       </w:pPr>
-      <w:bookmarkStart w:id="4" w:name="_Toc524312828"/>
-      <w:bookmarkStart w:id="5" w:name="_Toc222330407"/>
+      <w:bookmarkStart w:id="4" w:name="_Toc222330407"/>
+      <w:bookmarkStart w:id="5" w:name="_Toc524312828"/>
       <w:r>
         <w:rPr/>
         <w:t>Scope</w:t>
@@ -3311,8 +3302,8 @@
         <w:ind w:hanging="720" w:left="720"/>
         <w:rPr/>
       </w:pPr>
-      <w:bookmarkStart w:id="6" w:name="_Toc222330408"/>
-      <w:bookmarkStart w:id="7" w:name="_Toc524312829"/>
+      <w:bookmarkStart w:id="6" w:name="_Toc524312829"/>
+      <w:bookmarkStart w:id="7" w:name="_Toc222330408"/>
       <w:r>
         <w:rPr/>
         <w:t>Definitions, Acronyms, and Abbreviations</w:t>
@@ -3322,32 +3313,17 @@
     </w:p>
     <w:p>
       <w:pPr>
-        <w:pStyle w:val="InfoBlue"/>
-        <w:rPr/>
-      </w:pPr>
-      <w:r>
-        <w:rPr/>
-        <w:t xml:space="preserve">[This subsection provides the definitions of all terms, acronyms, and abbreviations required to properly interpret the </w:t>
-      </w:r>
-      <w:r>
-        <w:rPr>
-          <w:b/>
-        </w:rPr>
-        <w:t>Software Development Plan</w:t>
-      </w:r>
-      <w:r>
-        <w:rPr/>
-        <w:t>. This information may be provided by reference to the project’s Glossary.]</w:t>
-      </w:r>
-    </w:p>
-    <w:p>
-      <w:pPr>
-        <w:pStyle w:val="BodyText"/>
-        <w:rPr/>
-      </w:pPr>
-      <w:r>
-        <w:rPr/>
-        <w:t>See the Project Glossary.</w:t>
+        <w:pStyle w:val="Normal"/>
+        <w:ind w:hanging="720" w:left="720"/>
+        <w:rPr/>
+      </w:pPr>
+      <w:r>
+        <w:rPr/>
+        <w:tab/>
+      </w:r>
+      <w:r>
+        <w:rPr/>
+        <w:t>UPEDU – the Unified Process for EDUcation is the set of project artifact templates we will be using for this project’s documentation.</w:t>
       </w:r>
     </w:p>
     <w:p>
@@ -3356,8 +3332,8 @@
         <w:ind w:hanging="720" w:left="720"/>
         <w:rPr/>
       </w:pPr>
-      <w:bookmarkStart w:id="8" w:name="_Toc524312830"/>
-      <w:bookmarkStart w:id="9" w:name="_Toc222330409"/>
+      <w:bookmarkStart w:id="8" w:name="_Toc222330409"/>
+      <w:bookmarkStart w:id="9" w:name="_Toc524312830"/>
       <w:r>
         <w:rPr/>
         <w:t>References</w:t>
@@ -3561,8 +3537,8 @@
         <w:ind w:hanging="720" w:left="720"/>
         <w:rPr/>
       </w:pPr>
-      <w:bookmarkStart w:id="10" w:name="_Toc524312831"/>
-      <w:bookmarkStart w:id="11" w:name="_Toc222330410"/>
+      <w:bookmarkStart w:id="10" w:name="_Toc222330410"/>
+      <w:bookmarkStart w:id="11" w:name="_Toc524312831"/>
       <w:r>
         <w:rPr/>
         <w:t>Overview</w:t>
@@ -3681,8 +3657,8 @@
         <w:ind w:hanging="720" w:left="720"/>
         <w:rPr/>
       </w:pPr>
-      <w:bookmarkStart w:id="12" w:name="_Toc524312832"/>
-      <w:bookmarkStart w:id="13" w:name="_Toc222330411"/>
+      <w:bookmarkStart w:id="12" w:name="_Toc222330411"/>
+      <w:bookmarkStart w:id="13" w:name="_Toc524312832"/>
       <w:r>
         <w:rPr/>
         <w:t>Project Overview</w:t>
@@ -3700,8 +3676,8 @@
         <w:ind w:hanging="720" w:left="720"/>
         <w:rPr/>
       </w:pPr>
-      <w:bookmarkStart w:id="14" w:name="_Toc524312833"/>
-      <w:bookmarkStart w:id="15" w:name="_Toc222330412"/>
+      <w:bookmarkStart w:id="14" w:name="_Toc222330412"/>
+      <w:bookmarkStart w:id="15" w:name="_Toc524312833"/>
       <w:r>
         <w:rPr/>
         <w:t>Project Purpose, Scope, and Objectives</w:t>
@@ -3843,8 +3819,8 @@
         <w:ind w:hanging="720" w:left="720"/>
         <w:rPr/>
       </w:pPr>
-      <w:bookmarkStart w:id="16" w:name="_Toc524312834"/>
-      <w:bookmarkStart w:id="17" w:name="_Toc222330413"/>
+      <w:bookmarkStart w:id="16" w:name="_Toc222330413"/>
+      <w:bookmarkStart w:id="17" w:name="_Toc524312834"/>
       <w:r>
         <w:rPr/>
         <w:t>Assumptions and Constraints</w:t>
@@ -3908,8 +3884,8 @@
         <w:ind w:hanging="720" w:left="720"/>
         <w:rPr/>
       </w:pPr>
-      <w:bookmarkStart w:id="18" w:name="_Toc524312835"/>
-      <w:bookmarkStart w:id="19" w:name="_Toc222330414"/>
+      <w:bookmarkStart w:id="18" w:name="_Toc222330414"/>
+      <w:bookmarkStart w:id="19" w:name="_Toc524312835"/>
       <w:r>
         <w:rPr/>
         <w:t>Project Deliverables</w:t>
@@ -3993,8 +3969,8 @@
         <w:ind w:hanging="720" w:left="720"/>
         <w:rPr/>
       </w:pPr>
-      <w:bookmarkStart w:id="20" w:name="_Toc524312836"/>
-      <w:bookmarkStart w:id="21" w:name="_Toc222330415"/>
+      <w:bookmarkStart w:id="20" w:name="_Toc222330415"/>
+      <w:bookmarkStart w:id="21" w:name="_Toc524312836"/>
       <w:r>
         <w:rPr/>
         <w:t>Evolution of the Software Development Plan</w:t>
@@ -4038,8 +4014,8 @@
         <w:ind w:hanging="720" w:left="720"/>
         <w:rPr/>
       </w:pPr>
-      <w:bookmarkStart w:id="22" w:name="_Toc524312837"/>
-      <w:bookmarkStart w:id="23" w:name="_Toc222330416"/>
+      <w:bookmarkStart w:id="22" w:name="_Toc222330416"/>
+      <w:bookmarkStart w:id="23" w:name="_Toc524312837"/>
       <w:r>
         <w:rPr/>
         <w:t>Project Organization</w:t>
@@ -4053,8 +4029,8 @@
         <w:ind w:hanging="720" w:left="720"/>
         <w:rPr/>
       </w:pPr>
-      <w:bookmarkStart w:id="24" w:name="_Toc524312838"/>
-      <w:bookmarkStart w:id="25" w:name="_Toc222330417"/>
+      <w:bookmarkStart w:id="24" w:name="_Toc222330417"/>
+      <w:bookmarkStart w:id="25" w:name="_Toc524312838"/>
       <w:r>
         <w:rPr/>
         <w:t>Organizational Structure</w:t>
@@ -4080,8 +4056,8 @@
         <w:ind w:hanging="720" w:left="720"/>
         <w:rPr/>
       </w:pPr>
-      <w:bookmarkStart w:id="26" w:name="_Toc524312839"/>
-      <w:bookmarkStart w:id="27" w:name="_Toc222330418"/>
+      <w:bookmarkStart w:id="26" w:name="_Toc222330418"/>
+      <w:bookmarkStart w:id="27" w:name="_Toc524312839"/>
       <w:r>
         <w:rPr/>
         <w:t>External Interfaces</w:t>
@@ -4588,6 +4564,99 @@
               <w:rPr>
                 <w:szCs w:val="24"/>
               </w:rPr>
+              <w:t>Eric Faltermeier</w:t>
+            </w:r>
+          </w:p>
+          <w:p>
+            <w:pPr>
+              <w:pStyle w:val="Normal"/>
+              <w:numPr>
+                <w:ilvl w:val="0"/>
+                <w:numId w:val="16"/>
+              </w:numPr>
+              <w:rPr/>
+            </w:pPr>
+            <w:r>
+              <w:rPr>
+                <w:szCs w:val="24"/>
+              </w:rPr>
+              <w:t xml:space="preserve">Email: </w:t>
+            </w:r>
+            <w:hyperlink r:id="rId11">
+              <w:r>
+                <w:rPr>
+                  <w:rStyle w:val="Hyperlink"/>
+                  <w:rFonts w:ascii="Times New Roman" w:hAnsi="Times New Roman"/>
+                  <w:b w:val="false"/>
+                  <w:i w:val="false"/>
+                  <w:caps w:val="false"/>
+                  <w:smallCaps w:val="false"/>
+                  <w:spacing w:val="0"/>
+                  <w:sz w:val="20"/>
+                  <w:szCs w:val="20"/>
+                </w:rPr>
+                <w:t>e559f616</w:t>
+              </w:r>
+              <w:r>
+                <w:rPr>
+                  <w:rStyle w:val="Hyperlink"/>
+                  <w:rFonts w:ascii="Times New Roman" w:hAnsi="Times New Roman"/>
+                  <w:b w:val="false"/>
+                  <w:i w:val="false"/>
+                  <w:caps w:val="false"/>
+                  <w:smallCaps w:val="false"/>
+                  <w:spacing w:val="0"/>
+                  <w:sz w:val="20"/>
+                  <w:szCs w:val="20"/>
+                </w:rPr>
+                <w:t>@</w:t>
+              </w:r>
+              <w:r>
+                <w:rPr>
+                  <w:rStyle w:val="Hyperlink"/>
+                  <w:rFonts w:ascii="Times New Roman" w:hAnsi="Times New Roman"/>
+                  <w:b w:val="false"/>
+                  <w:i w:val="false"/>
+                  <w:caps w:val="false"/>
+                  <w:smallCaps w:val="false"/>
+                  <w:spacing w:val="0"/>
+                  <w:sz w:val="20"/>
+                  <w:szCs w:val="20"/>
+                </w:rPr>
+                <w:t>ku.edu</w:t>
+              </w:r>
+            </w:hyperlink>
+          </w:p>
+          <w:p>
+            <w:pPr>
+              <w:pStyle w:val="Normal"/>
+              <w:numPr>
+                <w:ilvl w:val="0"/>
+                <w:numId w:val="16"/>
+              </w:numPr>
+              <w:rPr>
+                <w:rFonts w:ascii="Times New Roman" w:hAnsi="Times New Roman"/>
+                <w:b w:val="false"/>
+                <w:i w:val="false"/>
+                <w:caps w:val="false"/>
+                <w:smallCaps w:val="false"/>
+                <w:spacing w:val="0"/>
+                <w:sz w:val="20"/>
+                <w:szCs w:val="20"/>
+              </w:rPr>
+            </w:pPr>
+            <w:r>
+              <w:rPr>
+                <w:rFonts w:ascii="Times New Roman" w:hAnsi="Times New Roman"/>
+                <w:b w:val="false"/>
+                <w:i w:val="false"/>
+                <w:caps w:val="false"/>
+                <w:smallCaps w:val="false"/>
+                <w:spacing w:val="0"/>
+                <w:sz w:val="20"/>
+                <w:szCs w:val="20"/>
+              </w:rPr>
+              <w:t>GitHub: Eric-Falt</w:t>
             </w:r>
           </w:p>
         </w:tc>
@@ -4612,6 +4681,7 @@
               <w:rPr>
                 <w:szCs w:val="24"/>
               </w:rPr>
+              <w:t>Meeting Lead, Programmer</w:t>
             </w:r>
           </w:p>
         </w:tc>
@@ -4738,7 +4808,7 @@
         <w:rPr/>
         <w:t xml:space="preserve">Anyone on the project can perform </w:t>
       </w:r>
-      <w:hyperlink r:id="rId11">
+      <w:hyperlink r:id="rId12">
         <w:r>
           <w:rPr>
             <w:rStyle w:val="Hyperlink"/>
@@ -4760,7 +4830,7 @@
         <w:rPr/>
         <w:t xml:space="preserve">For in-person availability, refer to this link: </w:t>
       </w:r>
-      <w:hyperlink r:id="rId12">
+      <w:hyperlink r:id="rId13">
         <w:r>
           <w:rPr>
             <w:rStyle w:val="Hyperlink"/>
@@ -4788,8 +4858,8 @@
         <w:ind w:hanging="720" w:left="720"/>
         <w:rPr/>
       </w:pPr>
-      <w:bookmarkStart w:id="30" w:name="_Toc524312841"/>
-      <w:bookmarkStart w:id="31" w:name="_Toc222330420"/>
+      <w:bookmarkStart w:id="30" w:name="_Toc222330420"/>
+      <w:bookmarkStart w:id="31" w:name="_Toc524312841"/>
       <w:r>
         <w:rPr/>
         <w:t>Management Process</w:t>
@@ -4803,8 +4873,8 @@
         <w:ind w:hanging="720" w:left="720"/>
         <w:rPr/>
       </w:pPr>
-      <w:bookmarkStart w:id="32" w:name="_Toc524312842"/>
-      <w:bookmarkStart w:id="33" w:name="_Toc222330421"/>
+      <w:bookmarkStart w:id="32" w:name="_Toc222330421"/>
+      <w:bookmarkStart w:id="33" w:name="_Toc524312842"/>
       <w:r>
         <w:rPr/>
         <w:t>Project Estimates</w:t>
@@ -4836,8 +4906,8 @@
         <w:ind w:hanging="720" w:left="720"/>
         <w:rPr/>
       </w:pPr>
-      <w:bookmarkStart w:id="34" w:name="_Toc524312843"/>
-      <w:bookmarkStart w:id="35" w:name="_Toc222330422"/>
+      <w:bookmarkStart w:id="34" w:name="_Toc222330422"/>
+      <w:bookmarkStart w:id="35" w:name="_Toc524312843"/>
       <w:r>
         <w:rPr/>
         <w:t>Project Plan</w:t>
@@ -4900,8 +4970,8 @@
         <w:ind w:hanging="720" w:left="720"/>
         <w:rPr/>
       </w:pPr>
-      <w:bookmarkStart w:id="38" w:name="_Toc524312845"/>
-      <w:bookmarkStart w:id="39" w:name="_Toc222330424"/>
+      <w:bookmarkStart w:id="38" w:name="_Toc222330424"/>
+      <w:bookmarkStart w:id="39" w:name="_Toc524312845"/>
       <w:r>
         <w:rPr/>
         <w:t>Iteration Objectives</w:t>
@@ -5172,8 +5242,8 @@
         <w:ind w:hanging="720" w:left="720"/>
         <w:rPr/>
       </w:pPr>
-      <w:bookmarkStart w:id="40" w:name="_Toc524312846"/>
-      <w:bookmarkStart w:id="41" w:name="_Toc222330425"/>
+      <w:bookmarkStart w:id="40" w:name="_Toc222330425"/>
+      <w:bookmarkStart w:id="41" w:name="_Toc524312846"/>
       <w:r>
         <w:rPr/>
         <w:t>Releases</w:t>
@@ -5199,8 +5269,8 @@
         <w:ind w:hanging="720" w:left="720"/>
         <w:rPr/>
       </w:pPr>
-      <w:bookmarkStart w:id="42" w:name="_Toc524312847"/>
-      <w:bookmarkStart w:id="43" w:name="_Toc222330426"/>
+      <w:bookmarkStart w:id="42" w:name="_Toc222330426"/>
+      <w:bookmarkStart w:id="43" w:name="_Toc524312847"/>
       <w:r>
         <w:rPr/>
         <w:t>Project Schedule</w:t>
@@ -5294,8 +5364,8 @@
         <w:ind w:hanging="720" w:left="720"/>
         <w:rPr/>
       </w:pPr>
-      <w:bookmarkStart w:id="44" w:name="_Toc524312848"/>
-      <w:bookmarkStart w:id="45" w:name="_Toc222330427"/>
+      <w:bookmarkStart w:id="44" w:name="_Toc222330427"/>
+      <w:bookmarkStart w:id="45" w:name="_Toc524312848"/>
       <w:r>
         <w:rPr/>
         <w:t>Project Resourcing</w:t>
@@ -5312,30 +5382,30 @@
           <w:color w:val="auto"/>
         </w:rPr>
       </w:pPr>
-      <w:bookmarkStart w:id="46" w:name="_Toc447095880"/>
-      <w:bookmarkStart w:id="47" w:name="_Toc456600917"/>
-      <w:bookmarkStart w:id="48" w:name="_Toc456598586"/>
-      <w:bookmarkStart w:id="49" w:name="_Toc512930368"/>
-      <w:bookmarkStart w:id="50" w:name="_Toc447095908"/>
-      <w:bookmarkStart w:id="51" w:name="_Toc512930367"/>
-      <w:bookmarkStart w:id="52" w:name="_Toc447095898"/>
-      <w:bookmarkStart w:id="53" w:name="_Toc430447691"/>
-      <w:bookmarkStart w:id="54" w:name="_Toc512930366"/>
-      <w:bookmarkStart w:id="55" w:name="_Toc447095897"/>
-      <w:bookmarkStart w:id="56" w:name="_Toc512930365"/>
-      <w:bookmarkStart w:id="57" w:name="_Toc447095896"/>
-      <w:bookmarkStart w:id="58" w:name="_Toc430447690"/>
-      <w:bookmarkStart w:id="59" w:name="_Toc512930364"/>
-      <w:bookmarkStart w:id="60" w:name="_Toc447095895"/>
-      <w:bookmarkStart w:id="61" w:name="_Toc430447689"/>
-      <w:bookmarkStart w:id="62" w:name="_Toc430447688"/>
-      <w:bookmarkStart w:id="63" w:name="_Toc512930363"/>
-      <w:bookmarkStart w:id="64" w:name="_Toc447095894"/>
-      <w:bookmarkStart w:id="65" w:name="_Toc430447687"/>
-      <w:bookmarkStart w:id="66" w:name="_Toc512930362"/>
-      <w:bookmarkStart w:id="67" w:name="_Toc447095893"/>
-      <w:bookmarkStart w:id="68" w:name="_Toc512930361"/>
-      <w:bookmarkStart w:id="69" w:name="_Toc447095892"/>
+      <w:bookmarkStart w:id="46" w:name="_Toc447095892"/>
+      <w:bookmarkStart w:id="47" w:name="_Toc512930361"/>
+      <w:bookmarkStart w:id="48" w:name="_Toc447095893"/>
+      <w:bookmarkStart w:id="49" w:name="_Toc512930362"/>
+      <w:bookmarkStart w:id="50" w:name="_Toc430447687"/>
+      <w:bookmarkStart w:id="51" w:name="_Toc447095894"/>
+      <w:bookmarkStart w:id="52" w:name="_Toc512930363"/>
+      <w:bookmarkStart w:id="53" w:name="_Toc430447688"/>
+      <w:bookmarkStart w:id="54" w:name="_Toc430447689"/>
+      <w:bookmarkStart w:id="55" w:name="_Toc447095895"/>
+      <w:bookmarkStart w:id="56" w:name="_Toc512930364"/>
+      <w:bookmarkStart w:id="57" w:name="_Toc430447690"/>
+      <w:bookmarkStart w:id="58" w:name="_Toc447095896"/>
+      <w:bookmarkStart w:id="59" w:name="_Toc512930365"/>
+      <w:bookmarkStart w:id="60" w:name="_Toc447095897"/>
+      <w:bookmarkStart w:id="61" w:name="_Toc512930366"/>
+      <w:bookmarkStart w:id="62" w:name="_Toc430447691"/>
+      <w:bookmarkStart w:id="63" w:name="_Toc447095898"/>
+      <w:bookmarkStart w:id="64" w:name="_Toc512930367"/>
+      <w:bookmarkStart w:id="65" w:name="_Toc447095908"/>
+      <w:bookmarkStart w:id="66" w:name="_Toc512930368"/>
+      <w:bookmarkStart w:id="67" w:name="_Toc456598586"/>
+      <w:bookmarkStart w:id="68" w:name="_Toc456600917"/>
+      <w:bookmarkStart w:id="69" w:name="_Toc447095880"/>
       <w:bookmarkEnd w:id="46"/>
       <w:bookmarkEnd w:id="47"/>
       <w:bookmarkEnd w:id="48"/>
@@ -5375,8 +5445,8 @@
         <w:ind w:hanging="720" w:left="720"/>
         <w:rPr/>
       </w:pPr>
-      <w:bookmarkStart w:id="70" w:name="_Toc513004379"/>
-      <w:bookmarkStart w:id="71" w:name="_Toc222330428"/>
+      <w:bookmarkStart w:id="70" w:name="_Toc222330428"/>
+      <w:bookmarkStart w:id="71" w:name="_Toc513004379"/>
       <w:r>
         <w:rPr/>
         <w:t>Project Monitoring and Control</w:t>
@@ -5393,8 +5463,8 @@
           <w:b w:val="false"/>
         </w:rPr>
       </w:pPr>
-      <w:bookmarkStart w:id="72" w:name="_Toc447095909"/>
-      <w:bookmarkStart w:id="73" w:name="_Toc222330429"/>
+      <w:bookmarkStart w:id="72" w:name="_Toc222330429"/>
+      <w:bookmarkStart w:id="73" w:name="_Toc447095909"/>
       <w:bookmarkStart w:id="74" w:name="_Toc447095910"/>
       <w:bookmarkEnd w:id="74"/>
       <w:r>
@@ -5442,8 +5512,8 @@
           <w:b w:val="false"/>
         </w:rPr>
       </w:pPr>
-      <w:bookmarkStart w:id="75" w:name="_Toc447095912"/>
-      <w:bookmarkStart w:id="76" w:name="_Toc222330430"/>
+      <w:bookmarkStart w:id="75" w:name="_Toc222330430"/>
+      <w:bookmarkStart w:id="76" w:name="_Toc447095912"/>
       <w:r>
         <w:rPr>
           <w:rStyle w:val="Strong"/>
@@ -5597,10 +5667,10 @@
       <w:tblGrid>
         <w:gridCol w:w="627"/>
         <w:gridCol w:w="2196"/>
-        <w:gridCol w:w="1103"/>
-        <w:gridCol w:w="979"/>
-        <w:gridCol w:w="2791"/>
-        <w:gridCol w:w="1160"/>
+        <w:gridCol w:w="1102"/>
+        <w:gridCol w:w="980"/>
+        <w:gridCol w:w="2790"/>
+        <w:gridCol w:w="1161"/>
       </w:tblGrid>
       <w:tr>
         <w:trPr/>
@@ -5652,7 +5722,7 @@
         </w:tc>
         <w:tc>
           <w:tcPr>
-            <w:tcW w:w="1103" w:type="dxa"/>
+            <w:tcW w:w="1102" w:type="dxa"/>
             <w:tcBorders>
               <w:top w:val="single" w:sz="4" w:space="0" w:color="000000"/>
               <w:left w:val="single" w:sz="4" w:space="0" w:color="000000"/>
@@ -5675,7 +5745,7 @@
         </w:tc>
         <w:tc>
           <w:tcPr>
-            <w:tcW w:w="979" w:type="dxa"/>
+            <w:tcW w:w="980" w:type="dxa"/>
             <w:tcBorders>
               <w:top w:val="single" w:sz="4" w:space="0" w:color="000000"/>
               <w:left w:val="single" w:sz="4" w:space="0" w:color="000000"/>
@@ -5698,7 +5768,7 @@
         </w:tc>
         <w:tc>
           <w:tcPr>
-            <w:tcW w:w="2791" w:type="dxa"/>
+            <w:tcW w:w="2790" w:type="dxa"/>
             <w:tcBorders>
               <w:top w:val="single" w:sz="4" w:space="0" w:color="000000"/>
               <w:left w:val="single" w:sz="4" w:space="0" w:color="000000"/>
@@ -5721,7 +5791,7 @@
         </w:tc>
         <w:tc>
           <w:tcPr>
-            <w:tcW w:w="1160" w:type="dxa"/>
+            <w:tcW w:w="1161" w:type="dxa"/>
             <w:tcBorders>
               <w:top w:val="single" w:sz="4" w:space="0" w:color="000000"/>
               <w:left w:val="single" w:sz="4" w:space="0" w:color="000000"/>
@@ -5793,7 +5863,7 @@
         </w:tc>
         <w:tc>
           <w:tcPr>
-            <w:tcW w:w="1103" w:type="dxa"/>
+            <w:tcW w:w="1102" w:type="dxa"/>
             <w:tcBorders>
               <w:top w:val="single" w:sz="4" w:space="0" w:color="000000"/>
               <w:left w:val="single" w:sz="4" w:space="0" w:color="000000"/>
@@ -5816,7 +5886,7 @@
         </w:tc>
         <w:tc>
           <w:tcPr>
-            <w:tcW w:w="979" w:type="dxa"/>
+            <w:tcW w:w="980" w:type="dxa"/>
             <w:tcBorders>
               <w:top w:val="single" w:sz="4" w:space="0" w:color="000000"/>
               <w:left w:val="single" w:sz="4" w:space="0" w:color="000000"/>
@@ -5839,7 +5909,7 @@
         </w:tc>
         <w:tc>
           <w:tcPr>
-            <w:tcW w:w="2791" w:type="dxa"/>
+            <w:tcW w:w="2790" w:type="dxa"/>
             <w:tcBorders>
               <w:top w:val="single" w:sz="4" w:space="0" w:color="000000"/>
               <w:left w:val="single" w:sz="4" w:space="0" w:color="000000"/>
@@ -5862,7 +5932,7 @@
         </w:tc>
         <w:tc>
           <w:tcPr>
-            <w:tcW w:w="1160" w:type="dxa"/>
+            <w:tcW w:w="1161" w:type="dxa"/>
             <w:tcBorders>
               <w:top w:val="single" w:sz="4" w:space="0" w:color="000000"/>
               <w:left w:val="single" w:sz="4" w:space="0" w:color="000000"/>
@@ -5934,7 +6004,7 @@
         </w:tc>
         <w:tc>
           <w:tcPr>
-            <w:tcW w:w="1103" w:type="dxa"/>
+            <w:tcW w:w="1102" w:type="dxa"/>
             <w:tcBorders>
               <w:top w:val="single" w:sz="4" w:space="0" w:color="000000"/>
               <w:left w:val="single" w:sz="4" w:space="0" w:color="000000"/>
@@ -5957,7 +6027,7 @@
         </w:tc>
         <w:tc>
           <w:tcPr>
-            <w:tcW w:w="979" w:type="dxa"/>
+            <w:tcW w:w="980" w:type="dxa"/>
             <w:tcBorders>
               <w:top w:val="single" w:sz="4" w:space="0" w:color="000000"/>
               <w:left w:val="single" w:sz="4" w:space="0" w:color="000000"/>
@@ -5980,7 +6050,7 @@
         </w:tc>
         <w:tc>
           <w:tcPr>
-            <w:tcW w:w="2791" w:type="dxa"/>
+            <w:tcW w:w="2790" w:type="dxa"/>
             <w:tcBorders>
               <w:top w:val="single" w:sz="4" w:space="0" w:color="000000"/>
               <w:left w:val="single" w:sz="4" w:space="0" w:color="000000"/>
@@ -6003,7 +6073,7 @@
         </w:tc>
         <w:tc>
           <w:tcPr>
-            <w:tcW w:w="1160" w:type="dxa"/>
+            <w:tcW w:w="1161" w:type="dxa"/>
             <w:tcBorders>
               <w:top w:val="single" w:sz="4" w:space="0" w:color="000000"/>
               <w:left w:val="single" w:sz="4" w:space="0" w:color="000000"/>
@@ -6075,7 +6145,7 @@
         </w:tc>
         <w:tc>
           <w:tcPr>
-            <w:tcW w:w="1103" w:type="dxa"/>
+            <w:tcW w:w="1102" w:type="dxa"/>
             <w:tcBorders>
               <w:top w:val="single" w:sz="4" w:space="0" w:color="000000"/>
               <w:left w:val="single" w:sz="4" w:space="0" w:color="000000"/>
@@ -6098,7 +6168,7 @@
         </w:tc>
         <w:tc>
           <w:tcPr>
-            <w:tcW w:w="979" w:type="dxa"/>
+            <w:tcW w:w="980" w:type="dxa"/>
             <w:tcBorders>
               <w:top w:val="single" w:sz="4" w:space="0" w:color="000000"/>
               <w:left w:val="single" w:sz="4" w:space="0" w:color="000000"/>
@@ -6121,7 +6191,7 @@
         </w:tc>
         <w:tc>
           <w:tcPr>
-            <w:tcW w:w="2791" w:type="dxa"/>
+            <w:tcW w:w="2790" w:type="dxa"/>
             <w:tcBorders>
               <w:top w:val="single" w:sz="4" w:space="0" w:color="000000"/>
               <w:left w:val="single" w:sz="4" w:space="0" w:color="000000"/>
@@ -6144,7 +6214,7 @@
         </w:tc>
         <w:tc>
           <w:tcPr>
-            <w:tcW w:w="1160" w:type="dxa"/>
+            <w:tcW w:w="1161" w:type="dxa"/>
             <w:tcBorders>
               <w:top w:val="single" w:sz="4" w:space="0" w:color="000000"/>
               <w:left w:val="single" w:sz="4" w:space="0" w:color="000000"/>
@@ -6216,7 +6286,7 @@
         </w:tc>
         <w:tc>
           <w:tcPr>
-            <w:tcW w:w="1103" w:type="dxa"/>
+            <w:tcW w:w="1102" w:type="dxa"/>
             <w:tcBorders>
               <w:top w:val="single" w:sz="4" w:space="0" w:color="000000"/>
               <w:left w:val="single" w:sz="4" w:space="0" w:color="000000"/>
@@ -6239,7 +6309,7 @@
         </w:tc>
         <w:tc>
           <w:tcPr>
-            <w:tcW w:w="979" w:type="dxa"/>
+            <w:tcW w:w="980" w:type="dxa"/>
             <w:tcBorders>
               <w:top w:val="single" w:sz="4" w:space="0" w:color="000000"/>
               <w:left w:val="single" w:sz="4" w:space="0" w:color="000000"/>
@@ -6262,7 +6332,7 @@
         </w:tc>
         <w:tc>
           <w:tcPr>
-            <w:tcW w:w="2791" w:type="dxa"/>
+            <w:tcW w:w="2790" w:type="dxa"/>
             <w:tcBorders>
               <w:top w:val="single" w:sz="4" w:space="0" w:color="000000"/>
               <w:left w:val="single" w:sz="4" w:space="0" w:color="000000"/>
@@ -6285,7 +6355,7 @@
         </w:tc>
         <w:tc>
           <w:tcPr>
-            <w:tcW w:w="1160" w:type="dxa"/>
+            <w:tcW w:w="1161" w:type="dxa"/>
             <w:tcBorders>
               <w:top w:val="single" w:sz="4" w:space="0" w:color="000000"/>
               <w:left w:val="single" w:sz="4" w:space="0" w:color="000000"/>
@@ -6357,7 +6427,7 @@
         </w:tc>
         <w:tc>
           <w:tcPr>
-            <w:tcW w:w="1103" w:type="dxa"/>
+            <w:tcW w:w="1102" w:type="dxa"/>
             <w:tcBorders>
               <w:top w:val="single" w:sz="4" w:space="0" w:color="000000"/>
               <w:left w:val="single" w:sz="4" w:space="0" w:color="000000"/>
@@ -6380,7 +6450,7 @@
         </w:tc>
         <w:tc>
           <w:tcPr>
-            <w:tcW w:w="979" w:type="dxa"/>
+            <w:tcW w:w="980" w:type="dxa"/>
             <w:tcBorders>
               <w:top w:val="single" w:sz="4" w:space="0" w:color="000000"/>
               <w:left w:val="single" w:sz="4" w:space="0" w:color="000000"/>
@@ -6403,7 +6473,7 @@
         </w:tc>
         <w:tc>
           <w:tcPr>
-            <w:tcW w:w="2791" w:type="dxa"/>
+            <w:tcW w:w="2790" w:type="dxa"/>
             <w:tcBorders>
               <w:top w:val="single" w:sz="4" w:space="0" w:color="000000"/>
               <w:left w:val="single" w:sz="4" w:space="0" w:color="000000"/>
@@ -6426,7 +6496,7 @@
         </w:tc>
         <w:tc>
           <w:tcPr>
-            <w:tcW w:w="1160" w:type="dxa"/>
+            <w:tcW w:w="1161" w:type="dxa"/>
             <w:tcBorders>
               <w:top w:val="single" w:sz="4" w:space="0" w:color="000000"/>
               <w:left w:val="single" w:sz="4" w:space="0" w:color="000000"/>
@@ -6488,11 +6558,11 @@
           <w:szCs w:val="24"/>
         </w:rPr>
       </w:pPr>
-      <w:bookmarkStart w:id="82" w:name="_Toc447095916"/>
-      <w:bookmarkStart w:id="83" w:name="_Toc512930370"/>
+      <w:bookmarkStart w:id="82" w:name="_Toc447095917"/>
+      <w:bookmarkStart w:id="83" w:name="_Toc512930369"/>
       <w:bookmarkStart w:id="84" w:name="_Toc447095932"/>
-      <w:bookmarkStart w:id="85" w:name="_Toc512930369"/>
-      <w:bookmarkStart w:id="86" w:name="_Toc447095917"/>
+      <w:bookmarkStart w:id="85" w:name="_Toc512930370"/>
+      <w:bookmarkStart w:id="86" w:name="_Toc447095916"/>
       <w:bookmarkEnd w:id="82"/>
       <w:bookmarkEnd w:id="83"/>
       <w:bookmarkEnd w:id="84"/>
@@ -6551,8 +6621,8 @@
         <w:ind w:hanging="720" w:left="720"/>
         <w:rPr/>
       </w:pPr>
-      <w:bookmarkStart w:id="87" w:name="_Toc513004381"/>
-      <w:bookmarkStart w:id="88" w:name="_Toc222330434"/>
+      <w:bookmarkStart w:id="87" w:name="_Toc222330434"/>
+      <w:bookmarkStart w:id="88" w:name="_Toc513004381"/>
       <w:r>
         <w:rPr/>
         <w:t>Annexes</w:t>
@@ -6611,12 +6681,12 @@
       </w:r>
     </w:p>
     <w:sectPr>
-      <w:headerReference w:type="even" r:id="rId13"/>
-      <w:headerReference w:type="default" r:id="rId14"/>
-      <w:headerReference w:type="first" r:id="rId15"/>
-      <w:footerReference w:type="even" r:id="rId16"/>
-      <w:footerReference w:type="default" r:id="rId17"/>
-      <w:footerReference w:type="first" r:id="rId18"/>
+      <w:headerReference w:type="even" r:id="rId14"/>
+      <w:headerReference w:type="default" r:id="rId15"/>
+      <w:headerReference w:type="first" r:id="rId16"/>
+      <w:footerReference w:type="even" r:id="rId17"/>
+      <w:footerReference w:type="default" r:id="rId18"/>
+      <w:footerReference w:type="first" r:id="rId19"/>
       <w:type w:val="nextPage"/>
       <w:pgSz w:w="12240" w:h="15840"/>
       <w:pgMar w:left="1440" w:right="1440" w:gutter="0" w:header="720" w:top="1440" w:footer="720" w:bottom="1440"/>
@@ -6689,30 +6759,35 @@
                           <w:r>
                             <w:rPr>
                               <w:rStyle w:val="PageNumber"/>
+                              <w:color w:val="000000"/>
                             </w:rPr>
                             <w:fldChar w:fldCharType="begin"/>
                           </w:r>
                           <w:r>
                             <w:rPr>
                               <w:rStyle w:val="PageNumber"/>
+                              <w:color w:val="000000"/>
                             </w:rPr>
                             <w:instrText xml:space="preserve"> PAGE </w:instrText>
                           </w:r>
                           <w:r>
                             <w:rPr>
                               <w:rStyle w:val="PageNumber"/>
+                              <w:color w:val="000000"/>
                             </w:rPr>
                             <w:fldChar w:fldCharType="separate"/>
                           </w:r>
                           <w:r>
                             <w:rPr>
                               <w:rStyle w:val="PageNumber"/>
+                              <w:color w:val="000000"/>
                             </w:rPr>
                             <w:t>0</w:t>
                           </w:r>
                           <w:r>
                             <w:rPr>
                               <w:rStyle w:val="PageNumber"/>
+                              <w:color w:val="000000"/>
                             </w:rPr>
                             <w:fldChar w:fldCharType="end"/>
                           </w:r>
@@ -6730,8 +6805,8 @@
         </mc:Choice>
         <mc:Fallback>
           <w:pict>
-            <v:rect id="shape_0" fillcolor="white" stroked="f" o:allowincell="f" style="position:absolute;margin-left:0pt;margin-top:0.05pt;width:1.1pt;height:1.1pt;mso-wrap-style:square;v-text-anchor:top;mso-position-horizontal:right;mso-position-horizontal-relative:margin">
-              <v:fill o:detectmouseclick="t" type="solid" color2="black" opacity="0"/>
+            <v:rect id="shape_0" stroked="f" o:allowincell="f" style="position:absolute;margin-left:0pt;margin-top:0.05pt;width:1.1pt;height:1.1pt;mso-wrap-style:square;v-text-anchor:top;mso-position-horizontal:right;mso-position-horizontal-relative:margin">
+              <v:fill o:detectmouseclick="t" on="false"/>
               <v:stroke color="#3465a4" joinstyle="round" endcap="flat"/>
               <v:textbox>
                 <w:txbxContent>
@@ -6745,30 +6820,35 @@
                     <w:r>
                       <w:rPr>
                         <w:rStyle w:val="PageNumber"/>
+                        <w:color w:val="000000"/>
                       </w:rPr>
                       <w:fldChar w:fldCharType="begin"/>
                     </w:r>
                     <w:r>
                       <w:rPr>
                         <w:rStyle w:val="PageNumber"/>
+                        <w:color w:val="000000"/>
                       </w:rPr>
                       <w:instrText xml:space="preserve"> PAGE </w:instrText>
                     </w:r>
                     <w:r>
                       <w:rPr>
                         <w:rStyle w:val="PageNumber"/>
+                        <w:color w:val="000000"/>
                       </w:rPr>
                       <w:fldChar w:fldCharType="separate"/>
                     </w:r>
                     <w:r>
                       <w:rPr>
                         <w:rStyle w:val="PageNumber"/>
+                        <w:color w:val="000000"/>
                       </w:rPr>
                       <w:t>0</w:t>
                     </w:r>
                     <w:r>
                       <w:rPr>
                         <w:rStyle w:val="PageNumber"/>
+                        <w:color w:val="000000"/>
                       </w:rPr>
                       <w:fldChar w:fldCharType="end"/>
                     </w:r>
@@ -9774,6 +9854,143 @@
       </w:rPr>
     </w:lvl>
   </w:abstractNum>
+  <w:abstractNum w:abstractNumId="16">
+    <w:lvl w:ilvl="0">
+      <w:start w:val="1"/>
+      <w:numFmt w:val="bullet"/>
+      <w:lvlText w:val=""/>
+      <w:lvlJc w:val="left"/>
+      <w:pPr>
+        <w:tabs>
+          <w:tab w:val="num" w:pos="720"/>
+        </w:tabs>
+        <w:ind w:left="720" w:hanging="360"/>
+      </w:pPr>
+      <w:rPr>
+        <w:rFonts w:ascii="Symbol" w:hAnsi="Symbol" w:cs="Symbol" w:hint="default"/>
+      </w:rPr>
+    </w:lvl>
+    <w:lvl w:ilvl="1">
+      <w:start w:val="1"/>
+      <w:numFmt w:val="bullet"/>
+      <w:lvlText w:val="◦"/>
+      <w:lvlJc w:val="left"/>
+      <w:pPr>
+        <w:tabs>
+          <w:tab w:val="num" w:pos="1080"/>
+        </w:tabs>
+        <w:ind w:left="1080" w:hanging="360"/>
+      </w:pPr>
+      <w:rPr>
+        <w:rFonts w:ascii="OpenSymbol" w:hAnsi="OpenSymbol" w:cs="OpenSymbol" w:hint="default"/>
+      </w:rPr>
+    </w:lvl>
+    <w:lvl w:ilvl="2">
+      <w:start w:val="1"/>
+      <w:numFmt w:val="bullet"/>
+      <w:lvlText w:val="▪"/>
+      <w:lvlJc w:val="left"/>
+      <w:pPr>
+        <w:tabs>
+          <w:tab w:val="num" w:pos="1440"/>
+        </w:tabs>
+        <w:ind w:left="1440" w:hanging="360"/>
+      </w:pPr>
+      <w:rPr>
+        <w:rFonts w:ascii="OpenSymbol" w:hAnsi="OpenSymbol" w:cs="OpenSymbol" w:hint="default"/>
+      </w:rPr>
+    </w:lvl>
+    <w:lvl w:ilvl="3">
+      <w:start w:val="1"/>
+      <w:numFmt w:val="bullet"/>
+      <w:lvlText w:val=""/>
+      <w:lvlJc w:val="left"/>
+      <w:pPr>
+        <w:tabs>
+          <w:tab w:val="num" w:pos="1800"/>
+        </w:tabs>
+        <w:ind w:left="1800" w:hanging="360"/>
+      </w:pPr>
+      <w:rPr>
+        <w:rFonts w:ascii="Symbol" w:hAnsi="Symbol" w:cs="Symbol" w:hint="default"/>
+      </w:rPr>
+    </w:lvl>
+    <w:lvl w:ilvl="4">
+      <w:start w:val="1"/>
+      <w:numFmt w:val="bullet"/>
+      <w:lvlText w:val="◦"/>
+      <w:lvlJc w:val="left"/>
+      <w:pPr>
+        <w:tabs>
+          <w:tab w:val="num" w:pos="2160"/>
+        </w:tabs>
+        <w:ind w:left="2160" w:hanging="360"/>
+      </w:pPr>
+      <w:rPr>
+        <w:rFonts w:ascii="OpenSymbol" w:hAnsi="OpenSymbol" w:cs="OpenSymbol" w:hint="default"/>
+      </w:rPr>
+    </w:lvl>
+    <w:lvl w:ilvl="5">
+      <w:start w:val="1"/>
+      <w:numFmt w:val="bullet"/>
+      <w:lvlText w:val="▪"/>
+      <w:lvlJc w:val="left"/>
+      <w:pPr>
+        <w:tabs>
+          <w:tab w:val="num" w:pos="2520"/>
+        </w:tabs>
+        <w:ind w:left="2520" w:hanging="360"/>
+      </w:pPr>
+      <w:rPr>
+        <w:rFonts w:ascii="OpenSymbol" w:hAnsi="OpenSymbol" w:cs="OpenSymbol" w:hint="default"/>
+      </w:rPr>
+    </w:lvl>
+    <w:lvl w:ilvl="6">
+      <w:start w:val="1"/>
+      <w:numFmt w:val="bullet"/>
+      <w:lvlText w:val=""/>
+      <w:lvlJc w:val="left"/>
+      <w:pPr>
+        <w:tabs>
+          <w:tab w:val="num" w:pos="2880"/>
+        </w:tabs>
+        <w:ind w:left="2880" w:hanging="360"/>
+      </w:pPr>
+      <w:rPr>
+        <w:rFonts w:ascii="Symbol" w:hAnsi="Symbol" w:cs="Symbol" w:hint="default"/>
+      </w:rPr>
+    </w:lvl>
+    <w:lvl w:ilvl="7">
+      <w:start w:val="1"/>
+      <w:numFmt w:val="bullet"/>
+      <w:lvlText w:val="◦"/>
+      <w:lvlJc w:val="left"/>
+      <w:pPr>
+        <w:tabs>
+          <w:tab w:val="num" w:pos="3240"/>
+        </w:tabs>
+        <w:ind w:left="3240" w:hanging="360"/>
+      </w:pPr>
+      <w:rPr>
+        <w:rFonts w:ascii="OpenSymbol" w:hAnsi="OpenSymbol" w:cs="OpenSymbol" w:hint="default"/>
+      </w:rPr>
+    </w:lvl>
+    <w:lvl w:ilvl="8">
+      <w:start w:val="1"/>
+      <w:numFmt w:val="bullet"/>
+      <w:lvlText w:val="▪"/>
+      <w:lvlJc w:val="left"/>
+      <w:pPr>
+        <w:tabs>
+          <w:tab w:val="num" w:pos="3600"/>
+        </w:tabs>
+        <w:ind w:left="3600" w:hanging="360"/>
+      </w:pPr>
+      <w:rPr>
+        <w:rFonts w:ascii="OpenSymbol" w:hAnsi="OpenSymbol" w:cs="OpenSymbol" w:hint="default"/>
+      </w:rPr>
+    </w:lvl>
+  </w:abstractNum>
   <w:num w:numId="1">
     <w:abstractNumId w:val="1"/>
   </w:num>
@@ -9818,6 +10035,9 @@
   </w:num>
   <w:num w:numId="15">
     <w:abstractNumId w:val="15"/>
+  </w:num>
+  <w:num w:numId="16">
+    <w:abstractNumId w:val="16"/>
   </w:num>
 </w:numbering>
 </file>
@@ -10410,8 +10630,8 @@
     <w:basedOn w:val="DefaultParagraphFont"/>
     <w:rPr/>
   </w:style>
-  <w:style w:type="character" w:styleId="FootnoteCharacters" w:customStyle="1">
-    <w:name w:val="Footnote Characters"/>
+  <w:style w:type="character" w:styleId="FootnoteCharactersuser" w:customStyle="1">
+    <w:name w:val="Footnote Characters (user)"/>
     <w:semiHidden/>
     <w:qFormat/>
     <w:rPr>
@@ -10419,8 +10639,8 @@
       <w:vertAlign w:val="superscript"/>
     </w:rPr>
   </w:style>
-  <w:style w:type="character" w:styleId="FootnoteCharactersuser">
-    <w:name w:val="Footnote Characters (user)"/>
+  <w:style w:type="character" w:styleId="FootnoteCharacters">
+    <w:name w:val="Footnote Characters"/>
     <w:qFormat/>
     <w:rPr>
       <w:sz w:val="20"/>
@@ -10474,8 +10694,8 @@
       <w:shd w:fill="E1DFDD" w:val="clear"/>
     </w:rPr>
   </w:style>
-  <w:style w:type="character" w:styleId="Bulletsuser">
-    <w:name w:val="Bullets (user)"/>
+  <w:style w:type="character" w:styleId="Bullets">
+    <w:name w:val="Bullets"/>
     <w:qFormat/>
     <w:rPr>
       <w:rFonts w:ascii="OpenSymbol" w:hAnsi="OpenSymbol" w:eastAsia="OpenSymbol" w:cs="OpenSymbol"/>
@@ -10969,8 +11189,8 @@
       <w:color w:val="0000FF"/>
     </w:rPr>
   </w:style>
-  <w:style w:type="paragraph" w:styleId="FrameContents" w:customStyle="1">
-    <w:name w:val="Frame Contents"/>
+  <w:style w:type="paragraph" w:styleId="FrameContentsuser" w:customStyle="1">
+    <w:name w:val="Frame Contents (user)"/>
     <w:basedOn w:val="Normal"/>
     <w:qFormat/>
     <w:pPr/>
@@ -10988,8 +11208,8 @@
     </w:pPr>
     <w:rPr/>
   </w:style>
-  <w:style w:type="paragraph" w:styleId="FrameContentsuser">
-    <w:name w:val="Frame Contents (user)"/>
+  <w:style w:type="paragraph" w:styleId="FrameContents">
+    <w:name w:val="Frame Contents"/>
     <w:basedOn w:val="Normal"/>
     <w:qFormat/>
     <w:pPr/>

</xml_diff>